<commit_message>
feat: çoklu sınav evrak akışını ve sınıflandırmayı tamamla
</commit_message>
<xml_diff>
--- a/shared/templates/Ornek_Sinav_Kagidi_Soru_Bazli_Puan_Cizelgesi.docx
+++ b/shared/templates/Ornek_Sinav_Kagidi_Soru_Bazli_Puan_Cizelgesi.docx
@@ -80,7 +80,27 @@
           <w:sz w:val="24"/>
           <w:szCs w:val="24"/>
         </w:rPr>
-        <w:t>20....-20.... EĞİTİM VE ÖĞRETİM YILI</w:t>
+        <w:t>20</w:t>
+      </w:r>
+      <w:proofErr w:type="gramStart"/>
+      <w:r>
+        <w:rPr>
+          <w:rFonts w:ascii="Times New Roman" w:hAnsi="Times New Roman" w:cs="Times New Roman"/>
+          <w:b/>
+          <w:sz w:val="24"/>
+          <w:szCs w:val="24"/>
+        </w:rPr>
+        <w:t>....-</w:t>
+      </w:r>
+      <w:proofErr w:type="gramEnd"/>
+      <w:r>
+        <w:rPr>
+          <w:rFonts w:ascii="Times New Roman" w:hAnsi="Times New Roman" w:cs="Times New Roman"/>
+          <w:b/>
+          <w:sz w:val="24"/>
+          <w:szCs w:val="24"/>
+        </w:rPr>
+        <w:t>20.... EĞİTİM VE ÖĞRETİM YILI</w:t>
       </w:r>
     </w:p>
     <w:p>
@@ -151,6 +171,7 @@
                 <w:szCs w:val="16"/>
               </w:rPr>
             </w:pPr>
+            <w:proofErr w:type="spellStart"/>
             <w:r>
               <w:rPr>
                 <w:rFonts w:ascii="Times New Roman" w:hAnsi="Times New Roman" w:cs="Times New Roman"/>
@@ -158,7 +179,272 @@
                 <w:sz w:val="16"/>
                 <w:szCs w:val="16"/>
               </w:rPr>
-              <w:t>Öğrencinin Adı-Soyadı</w:t>
+              <w:t>Öğrencinin</w:t>
+            </w:r>
+            <w:proofErr w:type="spellEnd"/>
+            <w:r>
+              <w:rPr>
+                <w:rFonts w:ascii="Times New Roman" w:hAnsi="Times New Roman" w:cs="Times New Roman"/>
+                <w:b/>
+                <w:sz w:val="16"/>
+                <w:szCs w:val="16"/>
+              </w:rPr>
+              <w:t xml:space="preserve"> </w:t>
+            </w:r>
+            <w:proofErr w:type="spellStart"/>
+            <w:r>
+              <w:rPr>
+                <w:rFonts w:ascii="Times New Roman" w:hAnsi="Times New Roman" w:cs="Times New Roman"/>
+                <w:b/>
+                <w:sz w:val="16"/>
+                <w:szCs w:val="16"/>
+              </w:rPr>
+              <w:t>Adı-Soyadı</w:t>
+            </w:r>
+            <w:proofErr w:type="spellEnd"/>
+          </w:p>
+        </w:tc>
+        <w:tc>
+          <w:tcPr>
+            <w:tcW w:w="2079" w:type="pct"/>
+            <w:tcMar>
+              <w:top w:w="60" w:type="dxa"/>
+              <w:left w:w="80" w:type="dxa"/>
+              <w:bottom w:w="60" w:type="dxa"/>
+              <w:right w:w="80" w:type="dxa"/>
+            </w:tcMar>
+            <w:vAlign w:val="center"/>
+          </w:tcPr>
+          <w:p>
+            <w:pPr>
+              <w:spacing w:after="0" w:line="240" w:lineRule="auto"/>
+              <w:rPr>
+                <w:rFonts w:ascii="Times New Roman" w:hAnsi="Times New Roman" w:cs="Times New Roman"/>
+                <w:b/>
+                <w:sz w:val="16"/>
+                <w:szCs w:val="16"/>
+              </w:rPr>
+            </w:pPr>
+          </w:p>
+        </w:tc>
+        <w:tc>
+          <w:tcPr>
+            <w:tcW w:w="536" w:type="pct"/>
+            <w:shd w:val="clear" w:color="auto" w:fill="C6D9F1" w:themeFill="text2" w:themeFillTint="33"/>
+            <w:vAlign w:val="center"/>
+          </w:tcPr>
+          <w:p>
+            <w:pPr>
+              <w:rPr>
+                <w:rFonts w:ascii="Times New Roman" w:hAnsi="Times New Roman" w:cs="Times New Roman"/>
+                <w:b/>
+                <w:sz w:val="16"/>
+                <w:szCs w:val="16"/>
+              </w:rPr>
+            </w:pPr>
+            <w:proofErr w:type="spellStart"/>
+            <w:r>
+              <w:rPr>
+                <w:rFonts w:ascii="Times New Roman" w:hAnsi="Times New Roman" w:cs="Times New Roman"/>
+                <w:b/>
+                <w:sz w:val="16"/>
+                <w:szCs w:val="16"/>
+              </w:rPr>
+              <w:t>Sınav</w:t>
+            </w:r>
+            <w:proofErr w:type="spellEnd"/>
+            <w:r>
+              <w:rPr>
+                <w:rFonts w:ascii="Times New Roman" w:hAnsi="Times New Roman" w:cs="Times New Roman"/>
+                <w:b/>
+                <w:sz w:val="16"/>
+                <w:szCs w:val="16"/>
+              </w:rPr>
+              <w:t xml:space="preserve"> </w:t>
+            </w:r>
+            <w:proofErr w:type="spellStart"/>
+            <w:r>
+              <w:rPr>
+                <w:rFonts w:ascii="Times New Roman" w:hAnsi="Times New Roman" w:cs="Times New Roman"/>
+                <w:b/>
+                <w:sz w:val="16"/>
+                <w:szCs w:val="16"/>
+              </w:rPr>
+              <w:t>Türü</w:t>
+            </w:r>
+            <w:proofErr w:type="spellEnd"/>
+          </w:p>
+        </w:tc>
+        <w:tc>
+          <w:tcPr>
+            <w:tcW w:w="1542" w:type="pct"/>
+            <w:vAlign w:val="center"/>
+          </w:tcPr>
+          <w:p>
+            <w:pPr>
+              <w:spacing w:after="0" w:line="240" w:lineRule="auto"/>
+              <w:rPr>
+                <w:rFonts w:ascii="Times New Roman" w:hAnsi="Times New Roman" w:cs="Times New Roman"/>
+                <w:b/>
+                <w:sz w:val="16"/>
+                <w:szCs w:val="16"/>
+              </w:rPr>
+            </w:pPr>
+            <w:r>
+              <w:rPr>
+                <w:rFonts w:ascii="Segoe UI Symbol" w:hAnsi="Segoe UI Symbol" w:cs="Segoe UI Symbol"/>
+                <w:b/>
+                <w:sz w:val="16"/>
+                <w:szCs w:val="16"/>
+              </w:rPr>
+              <w:t>☐</w:t>
+            </w:r>
+            <w:r>
+              <w:rPr>
+                <w:rFonts w:ascii="Times New Roman" w:hAnsi="Times New Roman" w:cs="Times New Roman"/>
+                <w:b/>
+                <w:sz w:val="16"/>
+                <w:szCs w:val="16"/>
+              </w:rPr>
+              <w:t xml:space="preserve"> </w:t>
+            </w:r>
+            <w:proofErr w:type="spellStart"/>
+            <w:proofErr w:type="gramStart"/>
+            <w:r>
+              <w:rPr>
+                <w:rFonts w:ascii="Times New Roman" w:hAnsi="Times New Roman" w:cs="Times New Roman"/>
+                <w:b/>
+                <w:sz w:val="16"/>
+                <w:szCs w:val="16"/>
+              </w:rPr>
+              <w:t>Yazılı</w:t>
+            </w:r>
+            <w:proofErr w:type="spellEnd"/>
+            <w:r>
+              <w:rPr>
+                <w:rFonts w:ascii="Times New Roman" w:hAnsi="Times New Roman" w:cs="Times New Roman"/>
+                <w:b/>
+                <w:sz w:val="16"/>
+                <w:szCs w:val="16"/>
+              </w:rPr>
+              <w:t xml:space="preserve">  </w:t>
+            </w:r>
+            <w:r>
+              <w:rPr>
+                <w:rFonts w:ascii="Segoe UI Symbol" w:hAnsi="Segoe UI Symbol" w:cs="Segoe UI Symbol"/>
+                <w:b/>
+                <w:sz w:val="16"/>
+                <w:szCs w:val="16"/>
+              </w:rPr>
+              <w:t>☐</w:t>
+            </w:r>
+            <w:proofErr w:type="gramEnd"/>
+            <w:r>
+              <w:rPr>
+                <w:rFonts w:ascii="Times New Roman" w:hAnsi="Times New Roman" w:cs="Times New Roman"/>
+                <w:b/>
+                <w:sz w:val="16"/>
+                <w:szCs w:val="16"/>
+              </w:rPr>
+              <w:t xml:space="preserve"> 2. </w:t>
+            </w:r>
+            <w:proofErr w:type="spellStart"/>
+            <w:r>
+              <w:rPr>
+                <w:rFonts w:ascii="Times New Roman" w:hAnsi="Times New Roman" w:cs="Times New Roman"/>
+                <w:b/>
+                <w:sz w:val="16"/>
+                <w:szCs w:val="16"/>
+              </w:rPr>
+              <w:t>Dinleme</w:t>
+            </w:r>
+            <w:proofErr w:type="spellEnd"/>
+            <w:r>
+              <w:rPr>
+                <w:rFonts w:ascii="Times New Roman" w:hAnsi="Times New Roman" w:cs="Times New Roman"/>
+                <w:b/>
+                <w:sz w:val="16"/>
+                <w:szCs w:val="16"/>
+              </w:rPr>
+              <w:t xml:space="preserve"> </w:t>
+            </w:r>
+            <w:r>
+              <w:rPr>
+                <w:rFonts w:ascii="Segoe UI Symbol" w:hAnsi="Segoe UI Symbol" w:cs="Segoe UI Symbol"/>
+                <w:b/>
+                <w:sz w:val="16"/>
+                <w:szCs w:val="16"/>
+              </w:rPr>
+              <w:t>☐</w:t>
+            </w:r>
+            <w:r>
+              <w:rPr>
+                <w:rFonts w:ascii="Times New Roman" w:hAnsi="Times New Roman" w:cs="Times New Roman"/>
+                <w:b/>
+                <w:sz w:val="16"/>
+                <w:szCs w:val="16"/>
+              </w:rPr>
+              <w:t xml:space="preserve"> </w:t>
+            </w:r>
+            <w:proofErr w:type="spellStart"/>
+            <w:r>
+              <w:rPr>
+                <w:rFonts w:ascii="Times New Roman" w:hAnsi="Times New Roman" w:cs="Times New Roman"/>
+                <w:b/>
+                <w:sz w:val="16"/>
+                <w:szCs w:val="16"/>
+              </w:rPr>
+              <w:t>Konuşma</w:t>
+            </w:r>
+            <w:proofErr w:type="spellEnd"/>
+          </w:p>
+        </w:tc>
+      </w:tr>
+      <w:tr>
+        <w:trPr>
+          <w:trHeight w:hRule="exact" w:val="249"/>
+        </w:trPr>
+        <w:tc>
+          <w:tcPr>
+            <w:tcW w:w="843" w:type="pct"/>
+            <w:shd w:val="clear" w:color="auto" w:fill="C6D9F1" w:themeFill="text2" w:themeFillTint="33"/>
+            <w:tcMar>
+              <w:top w:w="60" w:type="dxa"/>
+              <w:left w:w="80" w:type="dxa"/>
+              <w:bottom w:w="60" w:type="dxa"/>
+              <w:right w:w="80" w:type="dxa"/>
+            </w:tcMar>
+            <w:vAlign w:val="center"/>
+          </w:tcPr>
+          <w:p>
+            <w:pPr>
+              <w:spacing w:after="0" w:line="240" w:lineRule="auto"/>
+              <w:rPr>
+                <w:rFonts w:ascii="Times New Roman" w:hAnsi="Times New Roman" w:cs="Times New Roman"/>
+                <w:b/>
+                <w:sz w:val="16"/>
+                <w:szCs w:val="16"/>
+              </w:rPr>
+            </w:pPr>
+            <w:proofErr w:type="spellStart"/>
+            <w:r>
+              <w:rPr>
+                <w:rFonts w:ascii="Times New Roman" w:hAnsi="Times New Roman" w:cs="Times New Roman"/>
+                <w:b/>
+                <w:sz w:val="16"/>
+                <w:szCs w:val="16"/>
+              </w:rPr>
+              <w:t>Öğrenci</w:t>
+            </w:r>
+            <w:proofErr w:type="spellEnd"/>
+            <w:r>
+              <w:rPr>
+                <w:rFonts w:ascii="Times New Roman" w:hAnsi="Times New Roman" w:cs="Times New Roman"/>
+                <w:b/>
+                <w:sz w:val="16"/>
+                <w:szCs w:val="16"/>
+              </w:rPr>
+              <w:t xml:space="preserve"> Okul No</w:t>
             </w:r>
           </w:p>
         </w:tc>
@@ -201,6 +487,7 @@
                 <w:szCs w:val="16"/>
               </w:rPr>
             </w:pPr>
+            <w:proofErr w:type="spellStart"/>
             <w:r>
               <w:rPr>
                 <w:rFonts w:ascii="Times New Roman" w:hAnsi="Times New Roman" w:cs="Times New Roman"/>
@@ -208,34 +495,9 @@
                 <w:sz w:val="16"/>
                 <w:szCs w:val="16"/>
               </w:rPr>
-              <w:t>Sınav Türü</w:t>
+              <w:t>Sınav</w:t>
             </w:r>
-          </w:p>
-        </w:tc>
-        <w:tc>
-          <w:tcPr>
-            <w:tcW w:w="1542" w:type="pct"/>
-            <w:vAlign w:val="center"/>
-          </w:tcPr>
-          <w:p>
-            <w:pPr>
-              <w:spacing w:after="0" w:line="240" w:lineRule="auto"/>
-              <w:rPr>
-                <w:rFonts w:ascii="Times New Roman" w:hAnsi="Times New Roman" w:cs="Times New Roman"/>
-                <w:b/>
-                <w:sz w:val="16"/>
-                <w:szCs w:val="16"/>
-              </w:rPr>
-            </w:pPr>
-            <w:r>
-              <w:rPr>
-                <w:rFonts w:ascii="Segoe UI Symbol" w:hAnsi="Segoe UI Symbol" w:cs="Segoe UI Symbol"/>
-                <w:b/>
-                <w:sz w:val="16"/>
-                <w:szCs w:val="16"/>
-              </w:rPr>
-              <w:t>☐</w:t>
-            </w:r>
+            <w:proofErr w:type="spellEnd"/>
             <w:r>
               <w:rPr>
                 <w:rFonts w:ascii="Times New Roman" w:hAnsi="Times New Roman" w:cs="Times New Roman"/>
@@ -243,17 +505,9 @@
                 <w:sz w:val="16"/>
                 <w:szCs w:val="16"/>
               </w:rPr>
-              <w:t xml:space="preserve"> Yazılı  </w:t>
+              <w:t xml:space="preserve"> </w:t>
             </w:r>
-            <w:r>
-              <w:rPr>
-                <w:rFonts w:ascii="Segoe UI Symbol" w:hAnsi="Segoe UI Symbol" w:cs="Segoe UI Symbol"/>
-                <w:b/>
-                <w:sz w:val="16"/>
-                <w:szCs w:val="16"/>
-              </w:rPr>
-              <w:t>☐</w:t>
-            </w:r>
+            <w:proofErr w:type="spellStart"/>
             <w:r>
               <w:rPr>
                 <w:rFonts w:ascii="Times New Roman" w:hAnsi="Times New Roman" w:cs="Times New Roman"/>
@@ -261,114 +515,9 @@
                 <w:sz w:val="16"/>
                 <w:szCs w:val="16"/>
               </w:rPr>
-              <w:t xml:space="preserve"> 2. Dinleme </w:t>
+              <w:t>Tarihi</w:t>
             </w:r>
-            <w:r>
-              <w:rPr>
-                <w:rFonts w:ascii="Segoe UI Symbol" w:hAnsi="Segoe UI Symbol" w:cs="Segoe UI Symbol"/>
-                <w:b/>
-                <w:sz w:val="16"/>
-                <w:szCs w:val="16"/>
-              </w:rPr>
-              <w:t>☐</w:t>
-            </w:r>
-            <w:r>
-              <w:rPr>
-                <w:rFonts w:ascii="Times New Roman" w:hAnsi="Times New Roman" w:cs="Times New Roman"/>
-                <w:b/>
-                <w:sz w:val="16"/>
-                <w:szCs w:val="16"/>
-              </w:rPr>
-              <w:t xml:space="preserve"> Konuşma</w:t>
-            </w:r>
-          </w:p>
-        </w:tc>
-      </w:tr>
-      <w:tr>
-        <w:trPr>
-          <w:trHeight w:hRule="exact" w:val="249"/>
-        </w:trPr>
-        <w:tc>
-          <w:tcPr>
-            <w:tcW w:w="843" w:type="pct"/>
-            <w:shd w:val="clear" w:color="auto" w:fill="C6D9F1" w:themeFill="text2" w:themeFillTint="33"/>
-            <w:tcMar>
-              <w:top w:w="60" w:type="dxa"/>
-              <w:left w:w="80" w:type="dxa"/>
-              <w:bottom w:w="60" w:type="dxa"/>
-              <w:right w:w="80" w:type="dxa"/>
-            </w:tcMar>
-            <w:vAlign w:val="center"/>
-          </w:tcPr>
-          <w:p>
-            <w:pPr>
-              <w:spacing w:after="0" w:line="240" w:lineRule="auto"/>
-              <w:rPr>
-                <w:rFonts w:ascii="Times New Roman" w:hAnsi="Times New Roman" w:cs="Times New Roman"/>
-                <w:b/>
-                <w:sz w:val="16"/>
-                <w:szCs w:val="16"/>
-              </w:rPr>
-            </w:pPr>
-            <w:r>
-              <w:rPr>
-                <w:rFonts w:ascii="Times New Roman" w:hAnsi="Times New Roman" w:cs="Times New Roman"/>
-                <w:b/>
-                <w:sz w:val="16"/>
-                <w:szCs w:val="16"/>
-              </w:rPr>
-              <w:t>Öğrenci Okul No</w:t>
-            </w:r>
-          </w:p>
-        </w:tc>
-        <w:tc>
-          <w:tcPr>
-            <w:tcW w:w="2079" w:type="pct"/>
-            <w:tcMar>
-              <w:top w:w="60" w:type="dxa"/>
-              <w:left w:w="80" w:type="dxa"/>
-              <w:bottom w:w="60" w:type="dxa"/>
-              <w:right w:w="80" w:type="dxa"/>
-            </w:tcMar>
-            <w:vAlign w:val="center"/>
-          </w:tcPr>
-          <w:p>
-            <w:pPr>
-              <w:spacing w:after="0" w:line="240" w:lineRule="auto"/>
-              <w:rPr>
-                <w:rFonts w:ascii="Times New Roman" w:hAnsi="Times New Roman" w:cs="Times New Roman"/>
-                <w:b/>
-                <w:sz w:val="16"/>
-                <w:szCs w:val="16"/>
-              </w:rPr>
-            </w:pPr>
-          </w:p>
-        </w:tc>
-        <w:tc>
-          <w:tcPr>
-            <w:tcW w:w="536" w:type="pct"/>
-            <w:shd w:val="clear" w:color="auto" w:fill="C6D9F1" w:themeFill="text2" w:themeFillTint="33"/>
-            <w:vAlign w:val="center"/>
-          </w:tcPr>
-          <w:p>
-            <w:pPr>
-              <w:spacing w:after="0" w:line="240" w:lineRule="auto"/>
-              <w:rPr>
-                <w:rFonts w:ascii="Times New Roman" w:hAnsi="Times New Roman" w:cs="Times New Roman"/>
-                <w:b/>
-                <w:sz w:val="16"/>
-                <w:szCs w:val="16"/>
-              </w:rPr>
-            </w:pPr>
-            <w:r>
-              <w:rPr>
-                <w:rFonts w:ascii="Times New Roman" w:hAnsi="Times New Roman" w:cs="Times New Roman"/>
-                <w:b/>
-                <w:sz w:val="16"/>
-                <w:szCs w:val="16"/>
-              </w:rPr>
-              <w:t>Sınav Tarihi</w:t>
-            </w:r>
+            <w:proofErr w:type="spellEnd"/>
           </w:p>
         </w:tc>
         <w:tc>
@@ -416,7 +565,6 @@
           </w:tcPr>
           <w:p>
             <w:pPr>
-              <w:spacing w:after="0" w:line="240" w:lineRule="auto"/>
               <w:rPr>
                 <w:rFonts w:ascii="Times New Roman" w:hAnsi="Times New Roman" w:cs="Times New Roman"/>
                 <w:b/>
@@ -424,6 +572,7 @@
                 <w:szCs w:val="16"/>
               </w:rPr>
             </w:pPr>
+            <w:proofErr w:type="spellStart"/>
             <w:r>
               <w:rPr>
                 <w:rFonts w:ascii="Times New Roman" w:hAnsi="Times New Roman" w:cs="Times New Roman"/>
@@ -431,8 +580,29 @@
                 <w:sz w:val="16"/>
                 <w:szCs w:val="16"/>
               </w:rPr>
-              <w:t>Sınıf/Şube</w:t>
+              <w:t>Sınıf</w:t>
             </w:r>
+            <w:proofErr w:type="spellEnd"/>
+            <w:r>
+              <w:rPr>
+                <w:rFonts w:ascii="Times New Roman" w:hAnsi="Times New Roman" w:cs="Times New Roman"/>
+                <w:b/>
+                <w:sz w:val="16"/>
+                <w:szCs w:val="16"/>
+              </w:rPr>
+              <w:t>/</w:t>
+            </w:r>
+            <w:proofErr w:type="spellStart"/>
+            <w:r>
+              <w:rPr>
+                <w:rFonts w:ascii="Times New Roman" w:hAnsi="Times New Roman" w:cs="Times New Roman"/>
+                <w:b/>
+                <w:sz w:val="16"/>
+                <w:szCs w:val="16"/>
+              </w:rPr>
+              <w:t>Şube</w:t>
+            </w:r>
+            <w:proofErr w:type="spellEnd"/>
           </w:p>
         </w:tc>
         <w:tc>
@@ -491,7 +661,27 @@
                 <w:sz w:val="16"/>
                 <w:szCs w:val="16"/>
               </w:rPr>
-              <w:t xml:space="preserve"> 1. Dönem   </w:t>
+              <w:t xml:space="preserve"> 1. </w:t>
+            </w:r>
+            <w:proofErr w:type="spellStart"/>
+            <w:r>
+              <w:rPr>
+                <w:rFonts w:ascii="Times New Roman" w:hAnsi="Times New Roman" w:cs="Times New Roman"/>
+                <w:b/>
+                <w:sz w:val="16"/>
+                <w:szCs w:val="16"/>
+              </w:rPr>
+              <w:t>Dönem</w:t>
+            </w:r>
+            <w:proofErr w:type="spellEnd"/>
+            <w:r>
+              <w:rPr>
+                <w:rFonts w:ascii="Times New Roman" w:hAnsi="Times New Roman" w:cs="Times New Roman"/>
+                <w:b/>
+                <w:sz w:val="16"/>
+                <w:szCs w:val="16"/>
+              </w:rPr>
+              <w:t xml:space="preserve">   </w:t>
             </w:r>
             <w:r>
               <w:rPr>
@@ -509,8 +699,19 @@
                 <w:sz w:val="16"/>
                 <w:szCs w:val="16"/>
               </w:rPr>
-              <w:t xml:space="preserve"> 2. Dönem</w:t>
+              <w:t xml:space="preserve"> 2. </w:t>
             </w:r>
+            <w:proofErr w:type="spellStart"/>
+            <w:r>
+              <w:rPr>
+                <w:rFonts w:ascii="Times New Roman" w:hAnsi="Times New Roman" w:cs="Times New Roman"/>
+                <w:b/>
+                <w:sz w:val="16"/>
+                <w:szCs w:val="16"/>
+              </w:rPr>
+              <w:t>Dönem</w:t>
+            </w:r>
+            <w:proofErr w:type="spellEnd"/>
           </w:p>
         </w:tc>
       </w:tr>
@@ -540,6 +741,7 @@
                 <w:szCs w:val="16"/>
               </w:rPr>
             </w:pPr>
+            <w:proofErr w:type="spellStart"/>
             <w:r>
               <w:rPr>
                 <w:rFonts w:ascii="Times New Roman" w:hAnsi="Times New Roman" w:cs="Times New Roman"/>
@@ -547,8 +749,29 @@
                 <w:sz w:val="16"/>
                 <w:szCs w:val="16"/>
               </w:rPr>
-              <w:t>Dersin Adı</w:t>
+              <w:t>Dersin</w:t>
             </w:r>
+            <w:proofErr w:type="spellEnd"/>
+            <w:r>
+              <w:rPr>
+                <w:rFonts w:ascii="Times New Roman" w:hAnsi="Times New Roman" w:cs="Times New Roman"/>
+                <w:b/>
+                <w:sz w:val="16"/>
+                <w:szCs w:val="16"/>
+              </w:rPr>
+              <w:t xml:space="preserve"> </w:t>
+            </w:r>
+            <w:proofErr w:type="spellStart"/>
+            <w:r>
+              <w:rPr>
+                <w:rFonts w:ascii="Times New Roman" w:hAnsi="Times New Roman" w:cs="Times New Roman"/>
+                <w:b/>
+                <w:sz w:val="16"/>
+                <w:szCs w:val="16"/>
+              </w:rPr>
+              <w:t>Adı</w:t>
+            </w:r>
+            <w:proofErr w:type="spellEnd"/>
           </w:p>
         </w:tc>
         <w:tc>
@@ -607,7 +830,28 @@
                 <w:sz w:val="16"/>
                 <w:szCs w:val="16"/>
               </w:rPr>
-              <w:t xml:space="preserve"> 1. Yazılı  </w:t>
+              <w:t xml:space="preserve"> 1. </w:t>
+            </w:r>
+            <w:proofErr w:type="spellStart"/>
+            <w:proofErr w:type="gramStart"/>
+            <w:r>
+              <w:rPr>
+                <w:rFonts w:ascii="Times New Roman" w:hAnsi="Times New Roman" w:cs="Times New Roman"/>
+                <w:b/>
+                <w:sz w:val="16"/>
+                <w:szCs w:val="16"/>
+              </w:rPr>
+              <w:t>Yazılı</w:t>
+            </w:r>
+            <w:proofErr w:type="spellEnd"/>
+            <w:r>
+              <w:rPr>
+                <w:rFonts w:ascii="Times New Roman" w:hAnsi="Times New Roman" w:cs="Times New Roman"/>
+                <w:b/>
+                <w:sz w:val="16"/>
+                <w:szCs w:val="16"/>
+              </w:rPr>
+              <w:t xml:space="preserve">  </w:t>
             </w:r>
             <w:r>
               <w:rPr>
@@ -618,6 +862,7 @@
               </w:rPr>
               <w:t>☐</w:t>
             </w:r>
+            <w:proofErr w:type="gramEnd"/>
             <w:r>
               <w:rPr>
                 <w:rFonts w:ascii="Times New Roman" w:hAnsi="Times New Roman" w:cs="Times New Roman"/>
@@ -625,7 +870,28 @@
                 <w:sz w:val="16"/>
                 <w:szCs w:val="16"/>
               </w:rPr>
-              <w:t xml:space="preserve"> 2. Yazılı  </w:t>
+              <w:t xml:space="preserve"> 2. </w:t>
+            </w:r>
+            <w:proofErr w:type="spellStart"/>
+            <w:proofErr w:type="gramStart"/>
+            <w:r>
+              <w:rPr>
+                <w:rFonts w:ascii="Times New Roman" w:hAnsi="Times New Roman" w:cs="Times New Roman"/>
+                <w:b/>
+                <w:sz w:val="16"/>
+                <w:szCs w:val="16"/>
+              </w:rPr>
+              <w:t>Yazılı</w:t>
+            </w:r>
+            <w:proofErr w:type="spellEnd"/>
+            <w:r>
+              <w:rPr>
+                <w:rFonts w:ascii="Times New Roman" w:hAnsi="Times New Roman" w:cs="Times New Roman"/>
+                <w:b/>
+                <w:sz w:val="16"/>
+                <w:szCs w:val="16"/>
+              </w:rPr>
+              <w:t xml:space="preserve">  </w:t>
             </w:r>
             <w:r>
               <w:rPr>
@@ -636,6 +902,7 @@
               </w:rPr>
               <w:t>☐</w:t>
             </w:r>
+            <w:proofErr w:type="gramEnd"/>
             <w:r>
               <w:rPr>
                 <w:rFonts w:ascii="Times New Roman" w:hAnsi="Times New Roman" w:cs="Times New Roman"/>
@@ -643,7 +910,27 @@
                 <w:sz w:val="16"/>
                 <w:szCs w:val="16"/>
               </w:rPr>
-              <w:t xml:space="preserve"> Diğer:</w:t>
+              <w:t xml:space="preserve"> </w:t>
+            </w:r>
+            <w:proofErr w:type="spellStart"/>
+            <w:r>
+              <w:rPr>
+                <w:rFonts w:ascii="Times New Roman" w:hAnsi="Times New Roman" w:cs="Times New Roman"/>
+                <w:b/>
+                <w:sz w:val="16"/>
+                <w:szCs w:val="16"/>
+              </w:rPr>
+              <w:t>Diğer</w:t>
+            </w:r>
+            <w:proofErr w:type="spellEnd"/>
+            <w:r>
+              <w:rPr>
+                <w:rFonts w:ascii="Times New Roman" w:hAnsi="Times New Roman" w:cs="Times New Roman"/>
+                <w:b/>
+                <w:sz w:val="16"/>
+                <w:szCs w:val="16"/>
+              </w:rPr>
+              <w:t>:</w:t>
             </w:r>
           </w:p>
         </w:tc>
@@ -651,7 +938,8 @@
     </w:tbl>
     <w:p>
       <w:pPr>
-        <w:spacing w:after="0"/>
+        <w:spacing w:after="80"/>
+        <w:jc w:val="center"/>
         <w:rPr>
           <w:rFonts w:ascii="Times New Roman" w:hAnsi="Times New Roman" w:cs="Times New Roman"/>
           <w:b/>
@@ -659,6 +947,174 @@
           <w:szCs w:val="16"/>
         </w:rPr>
       </w:pPr>
+      <w:proofErr w:type="spellStart"/>
+      <w:r>
+        <w:rPr>
+          <w:b/>
+        </w:rPr>
+        <w:t>Sınıf</w:t>
+      </w:r>
+      <w:proofErr w:type="spellEnd"/>
+      <w:r>
+        <w:rPr>
+          <w:b/>
+        </w:rPr>
+        <w:t>/</w:t>
+      </w:r>
+      <w:proofErr w:type="spellStart"/>
+      <w:r>
+        <w:rPr>
+          <w:b/>
+        </w:rPr>
+        <w:t>şube</w:t>
+      </w:r>
+      <w:proofErr w:type="spellEnd"/>
+      <w:r>
+        <w:rPr>
+          <w:b/>
+        </w:rPr>
+        <w:t xml:space="preserve"> (</w:t>
+      </w:r>
+      <w:proofErr w:type="spellStart"/>
+      <w:r>
+        <w:rPr>
+          <w:b/>
+        </w:rPr>
+        <w:t>örn</w:t>
+      </w:r>
+      <w:proofErr w:type="spellEnd"/>
+      <w:r>
+        <w:rPr>
+          <w:b/>
+        </w:rPr>
+        <w:t xml:space="preserve">. 9-A) </w:t>
+      </w:r>
+      <w:proofErr w:type="spellStart"/>
+      <w:r>
+        <w:rPr>
+          <w:b/>
+        </w:rPr>
+        <w:t>ve</w:t>
+      </w:r>
+      <w:proofErr w:type="spellEnd"/>
+      <w:r>
+        <w:rPr>
+          <w:b/>
+        </w:rPr>
+        <w:t xml:space="preserve"> </w:t>
+      </w:r>
+      <w:proofErr w:type="spellStart"/>
+      <w:r>
+        <w:rPr>
+          <w:b/>
+        </w:rPr>
+        <w:t>sınav</w:t>
+      </w:r>
+      <w:proofErr w:type="spellEnd"/>
+      <w:r>
+        <w:rPr>
+          <w:b/>
+        </w:rPr>
+        <w:t xml:space="preserve"> </w:t>
+      </w:r>
+      <w:proofErr w:type="spellStart"/>
+      <w:r>
+        <w:rPr>
+          <w:b/>
+        </w:rPr>
+        <w:t>türü</w:t>
+      </w:r>
+      <w:proofErr w:type="spellEnd"/>
+      <w:r>
+        <w:rPr>
+          <w:b/>
+        </w:rPr>
+        <w:t xml:space="preserve"> (</w:t>
+      </w:r>
+      <w:proofErr w:type="spellStart"/>
+      <w:r>
+        <w:rPr>
+          <w:b/>
+        </w:rPr>
+        <w:t>Yazılı</w:t>
+      </w:r>
+      <w:proofErr w:type="spellEnd"/>
+      <w:r>
+        <w:rPr>
+          <w:b/>
+        </w:rPr>
+        <w:t xml:space="preserve">, </w:t>
+      </w:r>
+      <w:proofErr w:type="spellStart"/>
+      <w:r>
+        <w:rPr>
+          <w:b/>
+        </w:rPr>
+        <w:t>Dinleme</w:t>
+      </w:r>
+      <w:proofErr w:type="spellEnd"/>
+      <w:r>
+        <w:rPr>
+          <w:b/>
+        </w:rPr>
+        <w:t xml:space="preserve"> </w:t>
+      </w:r>
+      <w:proofErr w:type="spellStart"/>
+      <w:r>
+        <w:rPr>
+          <w:b/>
+        </w:rPr>
+        <w:t>veya</w:t>
+      </w:r>
+      <w:proofErr w:type="spellEnd"/>
+      <w:r>
+        <w:rPr>
+          <w:b/>
+        </w:rPr>
+        <w:t xml:space="preserve"> </w:t>
+      </w:r>
+      <w:proofErr w:type="spellStart"/>
+      <w:r>
+        <w:rPr>
+          <w:b/>
+        </w:rPr>
+        <w:t>Konuşma</w:t>
+      </w:r>
+      <w:proofErr w:type="spellEnd"/>
+      <w:r>
+        <w:rPr>
+          <w:b/>
+        </w:rPr>
+        <w:t xml:space="preserve">) </w:t>
+      </w:r>
+      <w:proofErr w:type="spellStart"/>
+      <w:r>
+        <w:rPr>
+          <w:b/>
+        </w:rPr>
+        <w:t>mutlaka</w:t>
+      </w:r>
+      <w:proofErr w:type="spellEnd"/>
+      <w:r>
+        <w:rPr>
+          <w:b/>
+        </w:rPr>
+        <w:t xml:space="preserve"> </w:t>
+      </w:r>
+      <w:proofErr w:type="spellStart"/>
+      <w:r>
+        <w:rPr>
+          <w:b/>
+        </w:rPr>
+        <w:t>belirtilmelidir</w:t>
+      </w:r>
+      <w:proofErr w:type="spellEnd"/>
+      <w:r>
+        <w:rPr>
+          <w:b/>
+        </w:rPr>
+        <w:t>.</w:t>
+      </w:r>
     </w:p>
     <w:p>
       <w:pPr>
@@ -729,6 +1185,7 @@
                 <w:szCs w:val="16"/>
               </w:rPr>
             </w:pPr>
+            <w:proofErr w:type="spellStart"/>
             <w:r>
               <w:rPr>
                 <w:rFonts w:ascii="Times New Roman" w:hAnsi="Times New Roman" w:cs="Times New Roman"/>
@@ -738,6 +1195,7 @@
               </w:rPr>
               <w:t>Sorular</w:t>
             </w:r>
+            <w:proofErr w:type="spellEnd"/>
           </w:p>
         </w:tc>
         <w:tc>
@@ -1519,6 +1977,7 @@
                 <w:szCs w:val="16"/>
               </w:rPr>
             </w:pPr>
+            <w:proofErr w:type="spellStart"/>
             <w:r>
               <w:rPr>
                 <w:rFonts w:ascii="Times New Roman" w:hAnsi="Times New Roman" w:cs="Times New Roman"/>
@@ -1526,7 +1985,37 @@
                 <w:sz w:val="16"/>
                 <w:szCs w:val="16"/>
               </w:rPr>
-              <w:t>Öğrencinin Aldığı Puan</w:t>
+              <w:t>Öğrencinin</w:t>
+            </w:r>
+            <w:proofErr w:type="spellEnd"/>
+            <w:r>
+              <w:rPr>
+                <w:rFonts w:ascii="Times New Roman" w:hAnsi="Times New Roman" w:cs="Times New Roman"/>
+                <w:b/>
+                <w:sz w:val="16"/>
+                <w:szCs w:val="16"/>
+              </w:rPr>
+              <w:t xml:space="preserve"> </w:t>
+            </w:r>
+            <w:proofErr w:type="spellStart"/>
+            <w:r>
+              <w:rPr>
+                <w:rFonts w:ascii="Times New Roman" w:hAnsi="Times New Roman" w:cs="Times New Roman"/>
+                <w:b/>
+                <w:sz w:val="16"/>
+                <w:szCs w:val="16"/>
+              </w:rPr>
+              <w:t>Aldığı</w:t>
+            </w:r>
+            <w:proofErr w:type="spellEnd"/>
+            <w:r>
+              <w:rPr>
+                <w:rFonts w:ascii="Times New Roman" w:hAnsi="Times New Roman" w:cs="Times New Roman"/>
+                <w:b/>
+                <w:sz w:val="16"/>
+                <w:szCs w:val="16"/>
+              </w:rPr>
+              <w:t xml:space="preserve"> Puan</w:t>
             </w:r>
           </w:p>
         </w:tc>

</xml_diff>

<commit_message>
fix: çoklu sınavlarda ortak öğrenme çıktıları ve rapor bilgileri
</commit_message>
<xml_diff>
--- a/shared/templates/Ornek_Sinav_Kagidi_Soru_Bazli_Puan_Cizelgesi.docx
+++ b/shared/templates/Ornek_Sinav_Kagidi_Soru_Bazli_Puan_Cizelgesi.docx
@@ -8,6 +8,7 @@
         <w:jc w:val="center"/>
         <w:rPr>
           <w:rFonts w:ascii="Times New Roman" w:hAnsi="Times New Roman" w:cs="Times New Roman"/>
+          <w:b/>
           <w:sz w:val="24"/>
           <w:szCs w:val="24"/>
         </w:rPr>
@@ -28,6 +29,7 @@
         <w:jc w:val="center"/>
         <w:rPr>
           <w:rFonts w:ascii="Times New Roman" w:hAnsi="Times New Roman" w:cs="Times New Roman"/>
+          <w:b/>
           <w:sz w:val="24"/>
           <w:szCs w:val="24"/>
         </w:rPr>
@@ -48,6 +50,7 @@
         <w:jc w:val="center"/>
         <w:rPr>
           <w:rFonts w:ascii="Times New Roman" w:hAnsi="Times New Roman" w:cs="Times New Roman"/>
+          <w:b/>
           <w:sz w:val="24"/>
           <w:szCs w:val="24"/>
         </w:rPr>
@@ -127,7 +130,7 @@
     <w:tbl>
       <w:tblPr>
         <w:tblpPr w:leftFromText="141" w:rightFromText="141" w:vertAnchor="text" w:horzAnchor="margin" w:tblpXSpec="center" w:tblpY="202"/>
-        <w:tblW w:w="4950" w:type="pct"/>
+        <w:tblW w:w="4546" w:type="pct"/>
         <w:tblBorders>
           <w:top w:val="single" w:sz="5" w:space="0" w:color="7F8C8D"/>
           <w:left w:val="single" w:sz="5" w:space="0" w:color="7F8C8D"/>
@@ -140,18 +143,16 @@
         <w:tblLook w:val="04A0" w:firstRow="1" w:lastRow="0" w:firstColumn="1" w:lastColumn="0" w:noHBand="0" w:noVBand="1"/>
       </w:tblPr>
       <w:tblGrid>
-        <w:gridCol w:w="1782"/>
-        <w:gridCol w:w="4395"/>
-        <w:gridCol w:w="1133"/>
-        <w:gridCol w:w="3259"/>
+        <w:gridCol w:w="3363"/>
+        <w:gridCol w:w="6318"/>
       </w:tblGrid>
       <w:tr>
         <w:trPr>
-          <w:trHeight w:hRule="exact" w:val="249"/>
+          <w:trHeight w:hRule="exact" w:val="262"/>
         </w:trPr>
         <w:tc>
           <w:tcPr>
-            <w:tcW w:w="843" w:type="pct"/>
+            <w:tcW w:w="1737" w:type="pct"/>
             <w:shd w:val="clear" w:color="auto" w:fill="C6D9F1" w:themeFill="text2" w:themeFillTint="33"/>
             <w:tcMar>
               <w:top w:w="60" w:type="dxa"/>
@@ -167,8 +168,8 @@
               <w:rPr>
                 <w:rFonts w:ascii="Times New Roman" w:hAnsi="Times New Roman" w:cs="Times New Roman"/>
                 <w:b/>
-                <w:sz w:val="16"/>
-                <w:szCs w:val="16"/>
+                <w:sz w:val="20"/>
+                <w:szCs w:val="20"/>
               </w:rPr>
             </w:pPr>
             <w:proofErr w:type="spellStart"/>
@@ -176,8 +177,8 @@
               <w:rPr>
                 <w:rFonts w:ascii="Times New Roman" w:hAnsi="Times New Roman" w:cs="Times New Roman"/>
                 <w:b/>
-                <w:sz w:val="16"/>
-                <w:szCs w:val="16"/>
+                <w:sz w:val="20"/>
+                <w:szCs w:val="20"/>
               </w:rPr>
               <w:t>Öğrencinin</w:t>
             </w:r>
@@ -186,8 +187,8 @@
               <w:rPr>
                 <w:rFonts w:ascii="Times New Roman" w:hAnsi="Times New Roman" w:cs="Times New Roman"/>
                 <w:b/>
-                <w:sz w:val="16"/>
-                <w:szCs w:val="16"/>
+                <w:sz w:val="20"/>
+                <w:szCs w:val="20"/>
               </w:rPr>
               <w:t xml:space="preserve"> </w:t>
             </w:r>
@@ -196,8 +197,8 @@
               <w:rPr>
                 <w:rFonts w:ascii="Times New Roman" w:hAnsi="Times New Roman" w:cs="Times New Roman"/>
                 <w:b/>
-                <w:sz w:val="16"/>
-                <w:szCs w:val="16"/>
+                <w:sz w:val="20"/>
+                <w:szCs w:val="20"/>
               </w:rPr>
               <w:t>Adı-Soyadı</w:t>
             </w:r>
@@ -206,7 +207,7 @@
         </w:tc>
         <w:tc>
           <w:tcPr>
-            <w:tcW w:w="2079" w:type="pct"/>
+            <w:tcW w:w="3263" w:type="pct"/>
             <w:tcMar>
               <w:top w:w="60" w:type="dxa"/>
               <w:left w:w="80" w:type="dxa"/>
@@ -221,192 +222,20 @@
               <w:rPr>
                 <w:rFonts w:ascii="Times New Roman" w:hAnsi="Times New Roman" w:cs="Times New Roman"/>
                 <w:b/>
-                <w:sz w:val="16"/>
-                <w:szCs w:val="16"/>
+                <w:sz w:val="14"/>
+                <w:szCs w:val="14"/>
               </w:rPr>
             </w:pPr>
-          </w:p>
-        </w:tc>
-        <w:tc>
-          <w:tcPr>
-            <w:tcW w:w="536" w:type="pct"/>
-            <w:shd w:val="clear" w:color="auto" w:fill="C6D9F1" w:themeFill="text2" w:themeFillTint="33"/>
-            <w:vAlign w:val="center"/>
-          </w:tcPr>
-          <w:p>
-            <w:pPr>
-              <w:rPr>
-                <w:rFonts w:ascii="Times New Roman" w:hAnsi="Times New Roman" w:cs="Times New Roman"/>
-                <w:b/>
-                <w:sz w:val="16"/>
-                <w:szCs w:val="16"/>
-              </w:rPr>
-            </w:pPr>
-            <w:proofErr w:type="spellStart"/>
-            <w:r>
-              <w:rPr>
-                <w:rFonts w:ascii="Times New Roman" w:hAnsi="Times New Roman" w:cs="Times New Roman"/>
-                <w:b/>
-                <w:sz w:val="16"/>
-                <w:szCs w:val="16"/>
-              </w:rPr>
-              <w:t>Sınav</w:t>
-            </w:r>
-            <w:proofErr w:type="spellEnd"/>
-            <w:r>
-              <w:rPr>
-                <w:rFonts w:ascii="Times New Roman" w:hAnsi="Times New Roman" w:cs="Times New Roman"/>
-                <w:b/>
-                <w:sz w:val="16"/>
-                <w:szCs w:val="16"/>
-              </w:rPr>
-              <w:t xml:space="preserve"> </w:t>
-            </w:r>
-            <w:proofErr w:type="spellStart"/>
-            <w:r>
-              <w:rPr>
-                <w:rFonts w:ascii="Times New Roman" w:hAnsi="Times New Roman" w:cs="Times New Roman"/>
-                <w:b/>
-                <w:sz w:val="16"/>
-                <w:szCs w:val="16"/>
-              </w:rPr>
-              <w:t>Türü</w:t>
-            </w:r>
-            <w:proofErr w:type="spellEnd"/>
-          </w:p>
-        </w:tc>
-        <w:tc>
-          <w:tcPr>
-            <w:tcW w:w="1542" w:type="pct"/>
-            <w:vAlign w:val="center"/>
-          </w:tcPr>
-          <w:p>
-            <w:pPr>
-              <w:spacing w:after="0" w:line="240" w:lineRule="auto"/>
-              <w:rPr>
-                <w:rFonts w:ascii="Times New Roman" w:hAnsi="Times New Roman" w:cs="Times New Roman"/>
-                <w:b/>
-                <w:sz w:val="16"/>
-                <w:szCs w:val="16"/>
-              </w:rPr>
-            </w:pPr>
-            <w:r>
-              <w:rPr>
-                <w:rFonts w:ascii="Segoe UI Symbol" w:hAnsi="Segoe UI Symbol" w:cs="Segoe UI Symbol"/>
-                <w:b/>
-                <w:sz w:val="16"/>
-                <w:szCs w:val="16"/>
-              </w:rPr>
-              <w:t>☐</w:t>
-            </w:r>
-            <w:r>
-              <w:rPr>
-                <w:rFonts w:ascii="Times New Roman" w:hAnsi="Times New Roman" w:cs="Times New Roman"/>
-                <w:b/>
-                <w:sz w:val="16"/>
-                <w:szCs w:val="16"/>
-              </w:rPr>
-              <w:t xml:space="preserve"> </w:t>
-            </w:r>
-            <w:proofErr w:type="spellStart"/>
-            <w:proofErr w:type="gramStart"/>
-            <w:r>
-              <w:rPr>
-                <w:rFonts w:ascii="Times New Roman" w:hAnsi="Times New Roman" w:cs="Times New Roman"/>
-                <w:b/>
-                <w:sz w:val="16"/>
-                <w:szCs w:val="16"/>
-              </w:rPr>
-              <w:t>Yazılı</w:t>
-            </w:r>
-            <w:proofErr w:type="spellEnd"/>
-            <w:r>
-              <w:rPr>
-                <w:rFonts w:ascii="Times New Roman" w:hAnsi="Times New Roman" w:cs="Times New Roman"/>
-                <w:b/>
-                <w:sz w:val="16"/>
-                <w:szCs w:val="16"/>
-              </w:rPr>
-              <w:t xml:space="preserve">  </w:t>
-            </w:r>
-            <w:r>
-              <w:rPr>
-                <w:rFonts w:ascii="Segoe UI Symbol" w:hAnsi="Segoe UI Symbol" w:cs="Segoe UI Symbol"/>
-                <w:b/>
-                <w:sz w:val="16"/>
-                <w:szCs w:val="16"/>
-              </w:rPr>
-              <w:t>☐</w:t>
-            </w:r>
-            <w:proofErr w:type="gramEnd"/>
-            <w:r>
-              <w:rPr>
-                <w:rFonts w:ascii="Times New Roman" w:hAnsi="Times New Roman" w:cs="Times New Roman"/>
-                <w:b/>
-                <w:sz w:val="16"/>
-                <w:szCs w:val="16"/>
-              </w:rPr>
-              <w:t xml:space="preserve"> 2. </w:t>
-            </w:r>
-            <w:proofErr w:type="spellStart"/>
-            <w:r>
-              <w:rPr>
-                <w:rFonts w:ascii="Times New Roman" w:hAnsi="Times New Roman" w:cs="Times New Roman"/>
-                <w:b/>
-                <w:sz w:val="16"/>
-                <w:szCs w:val="16"/>
-              </w:rPr>
-              <w:t>Dinleme</w:t>
-            </w:r>
-            <w:proofErr w:type="spellEnd"/>
-            <w:r>
-              <w:rPr>
-                <w:rFonts w:ascii="Times New Roman" w:hAnsi="Times New Roman" w:cs="Times New Roman"/>
-                <w:b/>
-                <w:sz w:val="16"/>
-                <w:szCs w:val="16"/>
-              </w:rPr>
-              <w:t xml:space="preserve"> </w:t>
-            </w:r>
-            <w:r>
-              <w:rPr>
-                <w:rFonts w:ascii="Segoe UI Symbol" w:hAnsi="Segoe UI Symbol" w:cs="Segoe UI Symbol"/>
-                <w:b/>
-                <w:sz w:val="16"/>
-                <w:szCs w:val="16"/>
-              </w:rPr>
-              <w:t>☐</w:t>
-            </w:r>
-            <w:r>
-              <w:rPr>
-                <w:rFonts w:ascii="Times New Roman" w:hAnsi="Times New Roman" w:cs="Times New Roman"/>
-                <w:b/>
-                <w:sz w:val="16"/>
-                <w:szCs w:val="16"/>
-              </w:rPr>
-              <w:t xml:space="preserve"> </w:t>
-            </w:r>
-            <w:proofErr w:type="spellStart"/>
-            <w:r>
-              <w:rPr>
-                <w:rFonts w:ascii="Times New Roman" w:hAnsi="Times New Roman" w:cs="Times New Roman"/>
-                <w:b/>
-                <w:sz w:val="16"/>
-                <w:szCs w:val="16"/>
-              </w:rPr>
-              <w:t>Konuşma</w:t>
-            </w:r>
-            <w:proofErr w:type="spellEnd"/>
           </w:p>
         </w:tc>
       </w:tr>
       <w:tr>
         <w:trPr>
-          <w:trHeight w:hRule="exact" w:val="249"/>
+          <w:trHeight w:hRule="exact" w:val="262"/>
         </w:trPr>
         <w:tc>
           <w:tcPr>
-            <w:tcW w:w="843" w:type="pct"/>
+            <w:tcW w:w="1737" w:type="pct"/>
             <w:shd w:val="clear" w:color="auto" w:fill="C6D9F1" w:themeFill="text2" w:themeFillTint="33"/>
             <w:tcMar>
               <w:top w:w="60" w:type="dxa"/>
@@ -422,8 +251,8 @@
               <w:rPr>
                 <w:rFonts w:ascii="Times New Roman" w:hAnsi="Times New Roman" w:cs="Times New Roman"/>
                 <w:b/>
-                <w:sz w:val="16"/>
-                <w:szCs w:val="16"/>
+                <w:sz w:val="20"/>
+                <w:szCs w:val="20"/>
               </w:rPr>
             </w:pPr>
             <w:proofErr w:type="spellStart"/>
@@ -431,8 +260,8 @@
               <w:rPr>
                 <w:rFonts w:ascii="Times New Roman" w:hAnsi="Times New Roman" w:cs="Times New Roman"/>
                 <w:b/>
-                <w:sz w:val="16"/>
-                <w:szCs w:val="16"/>
+                <w:sz w:val="20"/>
+                <w:szCs w:val="20"/>
               </w:rPr>
               <w:t>Öğrenci</w:t>
             </w:r>
@@ -441,8 +270,8 @@
               <w:rPr>
                 <w:rFonts w:ascii="Times New Roman" w:hAnsi="Times New Roman" w:cs="Times New Roman"/>
                 <w:b/>
-                <w:sz w:val="16"/>
-                <w:szCs w:val="16"/>
+                <w:sz w:val="20"/>
+                <w:szCs w:val="20"/>
               </w:rPr>
               <w:t xml:space="preserve"> Okul No</w:t>
             </w:r>
@@ -450,7 +279,7 @@
         </w:tc>
         <w:tc>
           <w:tcPr>
-            <w:tcW w:w="2079" w:type="pct"/>
+            <w:tcW w:w="3263" w:type="pct"/>
             <w:tcMar>
               <w:top w:w="60" w:type="dxa"/>
               <w:left w:w="80" w:type="dxa"/>
@@ -465,263 +294,20 @@
               <w:rPr>
                 <w:rFonts w:ascii="Times New Roman" w:hAnsi="Times New Roman" w:cs="Times New Roman"/>
                 <w:b/>
-                <w:sz w:val="16"/>
-                <w:szCs w:val="16"/>
+                <w:sz w:val="14"/>
+                <w:szCs w:val="14"/>
               </w:rPr>
             </w:pPr>
-          </w:p>
-        </w:tc>
-        <w:tc>
-          <w:tcPr>
-            <w:tcW w:w="536" w:type="pct"/>
-            <w:shd w:val="clear" w:color="auto" w:fill="C6D9F1" w:themeFill="text2" w:themeFillTint="33"/>
-            <w:vAlign w:val="center"/>
-          </w:tcPr>
-          <w:p>
-            <w:pPr>
-              <w:spacing w:after="0" w:line="240" w:lineRule="auto"/>
-              <w:rPr>
-                <w:rFonts w:ascii="Times New Roman" w:hAnsi="Times New Roman" w:cs="Times New Roman"/>
-                <w:b/>
-                <w:sz w:val="16"/>
-                <w:szCs w:val="16"/>
-              </w:rPr>
-            </w:pPr>
-            <w:proofErr w:type="spellStart"/>
-            <w:r>
-              <w:rPr>
-                <w:rFonts w:ascii="Times New Roman" w:hAnsi="Times New Roman" w:cs="Times New Roman"/>
-                <w:b/>
-                <w:sz w:val="16"/>
-                <w:szCs w:val="16"/>
-              </w:rPr>
-              <w:t>Sınav</w:t>
-            </w:r>
-            <w:proofErr w:type="spellEnd"/>
-            <w:r>
-              <w:rPr>
-                <w:rFonts w:ascii="Times New Roman" w:hAnsi="Times New Roman" w:cs="Times New Roman"/>
-                <w:b/>
-                <w:sz w:val="16"/>
-                <w:szCs w:val="16"/>
-              </w:rPr>
-              <w:t xml:space="preserve"> </w:t>
-            </w:r>
-            <w:proofErr w:type="spellStart"/>
-            <w:r>
-              <w:rPr>
-                <w:rFonts w:ascii="Times New Roman" w:hAnsi="Times New Roman" w:cs="Times New Roman"/>
-                <w:b/>
-                <w:sz w:val="16"/>
-                <w:szCs w:val="16"/>
-              </w:rPr>
-              <w:t>Tarihi</w:t>
-            </w:r>
-            <w:proofErr w:type="spellEnd"/>
-          </w:p>
-        </w:tc>
-        <w:tc>
-          <w:tcPr>
-            <w:tcW w:w="1542" w:type="pct"/>
-            <w:vAlign w:val="center"/>
-          </w:tcPr>
-          <w:p>
-            <w:pPr>
-              <w:spacing w:after="0" w:line="240" w:lineRule="auto"/>
-              <w:rPr>
-                <w:rFonts w:ascii="Times New Roman" w:hAnsi="Times New Roman" w:cs="Times New Roman"/>
-                <w:b/>
-                <w:sz w:val="16"/>
-                <w:szCs w:val="16"/>
-              </w:rPr>
-            </w:pPr>
-            <w:r>
-              <w:rPr>
-                <w:rFonts w:ascii="Times New Roman" w:hAnsi="Times New Roman" w:cs="Times New Roman"/>
-                <w:b/>
-                <w:sz w:val="16"/>
-                <w:szCs w:val="16"/>
-              </w:rPr>
-              <w:t>.... / .... / 20....</w:t>
-            </w:r>
           </w:p>
         </w:tc>
       </w:tr>
       <w:tr>
         <w:trPr>
-          <w:trHeight w:hRule="exact" w:val="249"/>
+          <w:trHeight w:hRule="exact" w:val="262"/>
         </w:trPr>
         <w:tc>
           <w:tcPr>
-            <w:tcW w:w="843" w:type="pct"/>
-            <w:shd w:val="clear" w:color="auto" w:fill="C6D9F1" w:themeFill="text2" w:themeFillTint="33"/>
-            <w:tcMar>
-              <w:top w:w="60" w:type="dxa"/>
-              <w:left w:w="80" w:type="dxa"/>
-              <w:bottom w:w="60" w:type="dxa"/>
-              <w:right w:w="80" w:type="dxa"/>
-            </w:tcMar>
-            <w:vAlign w:val="center"/>
-          </w:tcPr>
-          <w:p>
-            <w:pPr>
-              <w:rPr>
-                <w:rFonts w:ascii="Times New Roman" w:hAnsi="Times New Roman" w:cs="Times New Roman"/>
-                <w:b/>
-                <w:sz w:val="16"/>
-                <w:szCs w:val="16"/>
-              </w:rPr>
-            </w:pPr>
-            <w:proofErr w:type="spellStart"/>
-            <w:r>
-              <w:rPr>
-                <w:rFonts w:ascii="Times New Roman" w:hAnsi="Times New Roman" w:cs="Times New Roman"/>
-                <w:b/>
-                <w:sz w:val="16"/>
-                <w:szCs w:val="16"/>
-              </w:rPr>
-              <w:t>Sınıf</w:t>
-            </w:r>
-            <w:proofErr w:type="spellEnd"/>
-            <w:r>
-              <w:rPr>
-                <w:rFonts w:ascii="Times New Roman" w:hAnsi="Times New Roman" w:cs="Times New Roman"/>
-                <w:b/>
-                <w:sz w:val="16"/>
-                <w:szCs w:val="16"/>
-              </w:rPr>
-              <w:t>/</w:t>
-            </w:r>
-            <w:proofErr w:type="spellStart"/>
-            <w:r>
-              <w:rPr>
-                <w:rFonts w:ascii="Times New Roman" w:hAnsi="Times New Roman" w:cs="Times New Roman"/>
-                <w:b/>
-                <w:sz w:val="16"/>
-                <w:szCs w:val="16"/>
-              </w:rPr>
-              <w:t>Şube</w:t>
-            </w:r>
-            <w:proofErr w:type="spellEnd"/>
-          </w:p>
-        </w:tc>
-        <w:tc>
-          <w:tcPr>
-            <w:tcW w:w="2079" w:type="pct"/>
-            <w:tcMar>
-              <w:top w:w="60" w:type="dxa"/>
-              <w:left w:w="80" w:type="dxa"/>
-              <w:bottom w:w="60" w:type="dxa"/>
-              <w:right w:w="80" w:type="dxa"/>
-            </w:tcMar>
-            <w:vAlign w:val="center"/>
-          </w:tcPr>
-          <w:p>
-            <w:pPr>
-              <w:spacing w:after="0" w:line="240" w:lineRule="auto"/>
-              <w:rPr>
-                <w:rFonts w:ascii="Times New Roman" w:hAnsi="Times New Roman" w:cs="Times New Roman"/>
-                <w:b/>
-                <w:sz w:val="16"/>
-                <w:szCs w:val="16"/>
-              </w:rPr>
-            </w:pPr>
-          </w:p>
-        </w:tc>
-        <w:tc>
-          <w:tcPr>
-            <w:tcW w:w="2078" w:type="pct"/>
-            <w:gridSpan w:val="2"/>
-            <w:vAlign w:val="center"/>
-          </w:tcPr>
-          <w:p>
-            <w:pPr>
-              <w:spacing w:after="0" w:line="240" w:lineRule="auto"/>
-              <w:jc w:val="center"/>
-              <w:rPr>
-                <w:rFonts w:ascii="Times New Roman" w:hAnsi="Times New Roman" w:cs="Times New Roman"/>
-                <w:b/>
-                <w:sz w:val="16"/>
-                <w:szCs w:val="16"/>
-              </w:rPr>
-            </w:pPr>
-            <w:r>
-              <w:rPr>
-                <w:rFonts w:ascii="Segoe UI Symbol" w:hAnsi="Segoe UI Symbol" w:cs="Segoe UI Symbol"/>
-                <w:b/>
-                <w:sz w:val="16"/>
-                <w:szCs w:val="16"/>
-              </w:rPr>
-              <w:t>☐</w:t>
-            </w:r>
-            <w:r>
-              <w:rPr>
-                <w:rFonts w:ascii="Times New Roman" w:hAnsi="Times New Roman" w:cs="Times New Roman"/>
-                <w:b/>
-                <w:sz w:val="16"/>
-                <w:szCs w:val="16"/>
-              </w:rPr>
-              <w:t xml:space="preserve"> 1. </w:t>
-            </w:r>
-            <w:proofErr w:type="spellStart"/>
-            <w:r>
-              <w:rPr>
-                <w:rFonts w:ascii="Times New Roman" w:hAnsi="Times New Roman" w:cs="Times New Roman"/>
-                <w:b/>
-                <w:sz w:val="16"/>
-                <w:szCs w:val="16"/>
-              </w:rPr>
-              <w:t>Dönem</w:t>
-            </w:r>
-            <w:proofErr w:type="spellEnd"/>
-            <w:r>
-              <w:rPr>
-                <w:rFonts w:ascii="Times New Roman" w:hAnsi="Times New Roman" w:cs="Times New Roman"/>
-                <w:b/>
-                <w:sz w:val="16"/>
-                <w:szCs w:val="16"/>
-              </w:rPr>
-              <w:t xml:space="preserve">   </w:t>
-            </w:r>
-            <w:r>
-              <w:rPr>
-                <w:rFonts w:ascii="Segoe UI Symbol" w:hAnsi="Segoe UI Symbol" w:cs="Segoe UI Symbol"/>
-                <w:b/>
-                <w:sz w:val="16"/>
-                <w:szCs w:val="16"/>
-              </w:rPr>
-              <w:t>☐</w:t>
-            </w:r>
-            <w:r>
-              <w:rPr>
-                <w:rFonts w:ascii="Times New Roman" w:hAnsi="Times New Roman" w:cs="Times New Roman"/>
-                <w:b/>
-                <w:sz w:val="16"/>
-                <w:szCs w:val="16"/>
-              </w:rPr>
-              <w:t xml:space="preserve"> 2. </w:t>
-            </w:r>
-            <w:proofErr w:type="spellStart"/>
-            <w:r>
-              <w:rPr>
-                <w:rFonts w:ascii="Times New Roman" w:hAnsi="Times New Roman" w:cs="Times New Roman"/>
-                <w:b/>
-                <w:sz w:val="16"/>
-                <w:szCs w:val="16"/>
-              </w:rPr>
-              <w:t>Dönem</w:t>
-            </w:r>
-            <w:proofErr w:type="spellEnd"/>
-          </w:p>
-        </w:tc>
-      </w:tr>
-      <w:tr>
-        <w:trPr>
-          <w:trHeight w:hRule="exact" w:val="249"/>
-        </w:trPr>
-        <w:tc>
-          <w:tcPr>
-            <w:tcW w:w="843" w:type="pct"/>
+            <w:tcW w:w="1737" w:type="pct"/>
             <w:shd w:val="clear" w:color="auto" w:fill="C6D9F1" w:themeFill="text2" w:themeFillTint="33"/>
             <w:tcMar>
               <w:top w:w="60" w:type="dxa"/>
@@ -737,8 +323,8 @@
               <w:rPr>
                 <w:rFonts w:ascii="Times New Roman" w:hAnsi="Times New Roman" w:cs="Times New Roman"/>
                 <w:b/>
-                <w:sz w:val="16"/>
-                <w:szCs w:val="16"/>
+                <w:sz w:val="20"/>
+                <w:szCs w:val="20"/>
               </w:rPr>
             </w:pPr>
             <w:proofErr w:type="spellStart"/>
@@ -746,37 +332,37 @@
               <w:rPr>
                 <w:rFonts w:ascii="Times New Roman" w:hAnsi="Times New Roman" w:cs="Times New Roman"/>
                 <w:b/>
-                <w:sz w:val="16"/>
-                <w:szCs w:val="16"/>
+                <w:sz w:val="20"/>
+                <w:szCs w:val="20"/>
               </w:rPr>
-              <w:t>Dersin</w:t>
+              <w:t>Sınıf</w:t>
             </w:r>
             <w:proofErr w:type="spellEnd"/>
             <w:r>
               <w:rPr>
                 <w:rFonts w:ascii="Times New Roman" w:hAnsi="Times New Roman" w:cs="Times New Roman"/>
                 <w:b/>
-                <w:sz w:val="16"/>
-                <w:szCs w:val="16"/>
+                <w:sz w:val="20"/>
+                <w:szCs w:val="20"/>
               </w:rPr>
-              <w:t xml:space="preserve"> </w:t>
+              <w:t>/</w:t>
             </w:r>
             <w:proofErr w:type="spellStart"/>
             <w:r>
               <w:rPr>
                 <w:rFonts w:ascii="Times New Roman" w:hAnsi="Times New Roman" w:cs="Times New Roman"/>
                 <w:b/>
-                <w:sz w:val="16"/>
-                <w:szCs w:val="16"/>
+                <w:sz w:val="20"/>
+                <w:szCs w:val="20"/>
               </w:rPr>
-              <w:t>Adı</w:t>
+              <w:t>Şube</w:t>
             </w:r>
             <w:proofErr w:type="spellEnd"/>
           </w:p>
         </w:tc>
         <w:tc>
           <w:tcPr>
-            <w:tcW w:w="2079" w:type="pct"/>
+            <w:tcW w:w="3263" w:type="pct"/>
             <w:tcMar>
               <w:top w:w="60" w:type="dxa"/>
               <w:left w:w="80" w:type="dxa"/>
@@ -791,124 +377,56 @@
               <w:rPr>
                 <w:rFonts w:ascii="Times New Roman" w:hAnsi="Times New Roman" w:cs="Times New Roman"/>
                 <w:b/>
-                <w:sz w:val="16"/>
-                <w:szCs w:val="16"/>
+                <w:sz w:val="14"/>
+                <w:szCs w:val="14"/>
               </w:rPr>
             </w:pPr>
           </w:p>
         </w:tc>
+      </w:tr>
+      <w:tr>
+        <w:trPr>
+          <w:trHeight w:hRule="exact" w:val="262"/>
+        </w:trPr>
         <w:tc>
           <w:tcPr>
-            <w:tcW w:w="2078" w:type="pct"/>
-            <w:gridSpan w:val="2"/>
+            <w:tcW w:w="1737" w:type="pct"/>
+            <w:shd w:val="clear" w:color="auto" w:fill="C6D9F1" w:themeFill="text2" w:themeFillTint="33"/>
+            <w:tcMar>
+              <w:top w:w="60" w:type="dxa"/>
+              <w:left w:w="80" w:type="dxa"/>
+              <w:bottom w:w="60" w:type="dxa"/>
+              <w:right w:w="80" w:type="dxa"/>
+            </w:tcMar>
             <w:vAlign w:val="center"/>
           </w:tcPr>
           <w:p>
             <w:pPr>
               <w:spacing w:after="0" w:line="240" w:lineRule="auto"/>
-              <w:jc w:val="center"/>
               <w:rPr>
                 <w:rFonts w:ascii="Times New Roman" w:hAnsi="Times New Roman" w:cs="Times New Roman"/>
                 <w:b/>
-                <w:sz w:val="16"/>
-                <w:szCs w:val="16"/>
+                <w:sz w:val="20"/>
+                <w:szCs w:val="20"/>
               </w:rPr>
             </w:pPr>
-            <w:r>
-              <w:rPr>
-                <w:rFonts w:ascii="Segoe UI Symbol" w:hAnsi="Segoe UI Symbol" w:cs="Segoe UI Symbol"/>
-                <w:b/>
-                <w:sz w:val="16"/>
-                <w:szCs w:val="16"/>
-              </w:rPr>
-              <w:t>☐</w:t>
-            </w:r>
+            <w:proofErr w:type="spellStart"/>
             <w:r>
               <w:rPr>
                 <w:rFonts w:ascii="Times New Roman" w:hAnsi="Times New Roman" w:cs="Times New Roman"/>
                 <w:b/>
-                <w:sz w:val="16"/>
-                <w:szCs w:val="16"/>
+                <w:sz w:val="20"/>
+                <w:szCs w:val="20"/>
               </w:rPr>
-              <w:t xml:space="preserve"> 1. </w:t>
-            </w:r>
-            <w:proofErr w:type="spellStart"/>
-            <w:proofErr w:type="gramStart"/>
-            <w:r>
-              <w:rPr>
-                <w:rFonts w:ascii="Times New Roman" w:hAnsi="Times New Roman" w:cs="Times New Roman"/>
-                <w:b/>
-                <w:sz w:val="16"/>
-                <w:szCs w:val="16"/>
-              </w:rPr>
-              <w:t>Yazılı</w:t>
+              <w:t>Sınav</w:t>
             </w:r>
             <w:proofErr w:type="spellEnd"/>
             <w:r>
               <w:rPr>
                 <w:rFonts w:ascii="Times New Roman" w:hAnsi="Times New Roman" w:cs="Times New Roman"/>
                 <w:b/>
-                <w:sz w:val="16"/>
-                <w:szCs w:val="16"/>
-              </w:rPr>
-              <w:t xml:space="preserve">  </w:t>
-            </w:r>
-            <w:r>
-              <w:rPr>
-                <w:rFonts w:ascii="Segoe UI Symbol" w:hAnsi="Segoe UI Symbol" w:cs="Segoe UI Symbol"/>
-                <w:b/>
-                <w:sz w:val="16"/>
-                <w:szCs w:val="16"/>
-              </w:rPr>
-              <w:t>☐</w:t>
-            </w:r>
-            <w:proofErr w:type="gramEnd"/>
-            <w:r>
-              <w:rPr>
-                <w:rFonts w:ascii="Times New Roman" w:hAnsi="Times New Roman" w:cs="Times New Roman"/>
-                <w:b/>
-                <w:sz w:val="16"/>
-                <w:szCs w:val="16"/>
-              </w:rPr>
-              <w:t xml:space="preserve"> 2. </w:t>
-            </w:r>
-            <w:proofErr w:type="spellStart"/>
-            <w:proofErr w:type="gramStart"/>
-            <w:r>
-              <w:rPr>
-                <w:rFonts w:ascii="Times New Roman" w:hAnsi="Times New Roman" w:cs="Times New Roman"/>
-                <w:b/>
-                <w:sz w:val="16"/>
-                <w:szCs w:val="16"/>
-              </w:rPr>
-              <w:t>Yazılı</w:t>
-            </w:r>
-            <w:proofErr w:type="spellEnd"/>
-            <w:r>
-              <w:rPr>
-                <w:rFonts w:ascii="Times New Roman" w:hAnsi="Times New Roman" w:cs="Times New Roman"/>
-                <w:b/>
-                <w:sz w:val="16"/>
-                <w:szCs w:val="16"/>
-              </w:rPr>
-              <w:t xml:space="preserve">  </w:t>
-            </w:r>
-            <w:r>
-              <w:rPr>
-                <w:rFonts w:ascii="Segoe UI Symbol" w:hAnsi="Segoe UI Symbol" w:cs="Segoe UI Symbol"/>
-                <w:b/>
-                <w:sz w:val="16"/>
-                <w:szCs w:val="16"/>
-              </w:rPr>
-              <w:t>☐</w:t>
-            </w:r>
-            <w:proofErr w:type="gramEnd"/>
-            <w:r>
-              <w:rPr>
-                <w:rFonts w:ascii="Times New Roman" w:hAnsi="Times New Roman" w:cs="Times New Roman"/>
-                <w:b/>
-                <w:sz w:val="16"/>
-                <w:szCs w:val="16"/>
+                <w:sz w:val="20"/>
+                <w:szCs w:val="20"/>
               </w:rPr>
               <w:t xml:space="preserve"> </w:t>
             </w:r>
@@ -917,222 +435,67 @@
               <w:rPr>
                 <w:rFonts w:ascii="Times New Roman" w:hAnsi="Times New Roman" w:cs="Times New Roman"/>
                 <w:b/>
-                <w:sz w:val="16"/>
-                <w:szCs w:val="16"/>
+                <w:sz w:val="20"/>
+                <w:szCs w:val="20"/>
               </w:rPr>
-              <w:t>Diğer</w:t>
+              <w:t>Türü</w:t>
             </w:r>
             <w:proofErr w:type="spellEnd"/>
-            <w:r>
+          </w:p>
+        </w:tc>
+        <w:tc>
+          <w:tcPr>
+            <w:tcW w:w="3263" w:type="pct"/>
+            <w:tcMar>
+              <w:top w:w="60" w:type="dxa"/>
+              <w:left w:w="80" w:type="dxa"/>
+              <w:bottom w:w="60" w:type="dxa"/>
+              <w:right w:w="80" w:type="dxa"/>
+            </w:tcMar>
+            <w:vAlign w:val="center"/>
+          </w:tcPr>
+          <w:p>
+            <w:pPr>
+              <w:spacing w:after="0" w:line="240" w:lineRule="auto"/>
               <w:rPr>
                 <w:rFonts w:ascii="Times New Roman" w:hAnsi="Times New Roman" w:cs="Times New Roman"/>
                 <w:b/>
-                <w:sz w:val="16"/>
-                <w:szCs w:val="16"/>
+                <w:sz w:val="14"/>
+                <w:szCs w:val="14"/>
               </w:rPr>
-              <w:t>:</w:t>
-            </w:r>
+            </w:pPr>
           </w:p>
         </w:tc>
       </w:tr>
     </w:tbl>
     <w:p>
       <w:pPr>
-        <w:spacing w:after="80"/>
+        <w:spacing w:after="0" w:line="240" w:lineRule="auto"/>
+        <w:rPr>
+          <w:rFonts w:ascii="Times New Roman" w:hAnsi="Times New Roman" w:cs="Times New Roman"/>
+          <w:b/>
+          <w:sz w:val="14"/>
+          <w:szCs w:val="14"/>
+        </w:rPr>
+      </w:pPr>
+    </w:p>
+    <w:p>
+      <w:pPr>
+        <w:spacing w:after="0" w:line="240" w:lineRule="auto"/>
         <w:jc w:val="center"/>
         <w:rPr>
           <w:rFonts w:ascii="Times New Roman" w:hAnsi="Times New Roman" w:cs="Times New Roman"/>
           <w:b/>
-          <w:sz w:val="16"/>
-          <w:szCs w:val="16"/>
-        </w:rPr>
-      </w:pPr>
-      <w:proofErr w:type="spellStart"/>
-      <w:r>
-        <w:rPr>
-          <w:b/>
-        </w:rPr>
-        <w:t>Sınıf</w:t>
-      </w:r>
-      <w:proofErr w:type="spellEnd"/>
-      <w:r>
-        <w:rPr>
-          <w:b/>
-        </w:rPr>
-        <w:t>/</w:t>
-      </w:r>
-      <w:proofErr w:type="spellStart"/>
-      <w:r>
-        <w:rPr>
-          <w:b/>
-        </w:rPr>
-        <w:t>şube</w:t>
-      </w:r>
-      <w:proofErr w:type="spellEnd"/>
-      <w:r>
-        <w:rPr>
-          <w:b/>
-        </w:rPr>
-        <w:t xml:space="preserve"> (</w:t>
-      </w:r>
-      <w:proofErr w:type="spellStart"/>
-      <w:r>
-        <w:rPr>
-          <w:b/>
-        </w:rPr>
-        <w:t>örn</w:t>
-      </w:r>
-      <w:proofErr w:type="spellEnd"/>
-      <w:r>
-        <w:rPr>
-          <w:b/>
-        </w:rPr>
-        <w:t xml:space="preserve">. 9-A) </w:t>
-      </w:r>
-      <w:proofErr w:type="spellStart"/>
-      <w:r>
-        <w:rPr>
-          <w:b/>
-        </w:rPr>
-        <w:t>ve</w:t>
-      </w:r>
-      <w:proofErr w:type="spellEnd"/>
-      <w:r>
-        <w:rPr>
-          <w:b/>
-        </w:rPr>
-        <w:t xml:space="preserve"> </w:t>
-      </w:r>
-      <w:proofErr w:type="spellStart"/>
-      <w:r>
-        <w:rPr>
-          <w:b/>
-        </w:rPr>
-        <w:t>sınav</w:t>
-      </w:r>
-      <w:proofErr w:type="spellEnd"/>
-      <w:r>
-        <w:rPr>
-          <w:b/>
-        </w:rPr>
-        <w:t xml:space="preserve"> </w:t>
-      </w:r>
-      <w:proofErr w:type="spellStart"/>
-      <w:r>
-        <w:rPr>
-          <w:b/>
-        </w:rPr>
-        <w:t>türü</w:t>
-      </w:r>
-      <w:proofErr w:type="spellEnd"/>
-      <w:r>
-        <w:rPr>
-          <w:b/>
-        </w:rPr>
-        <w:t xml:space="preserve"> (</w:t>
-      </w:r>
-      <w:proofErr w:type="spellStart"/>
-      <w:r>
-        <w:rPr>
-          <w:b/>
-        </w:rPr>
-        <w:t>Yazılı</w:t>
-      </w:r>
-      <w:proofErr w:type="spellEnd"/>
-      <w:r>
-        <w:rPr>
-          <w:b/>
-        </w:rPr>
-        <w:t xml:space="preserve">, </w:t>
-      </w:r>
-      <w:proofErr w:type="spellStart"/>
-      <w:r>
-        <w:rPr>
-          <w:b/>
-        </w:rPr>
-        <w:t>Dinleme</w:t>
-      </w:r>
-      <w:proofErr w:type="spellEnd"/>
-      <w:r>
-        <w:rPr>
-          <w:b/>
-        </w:rPr>
-        <w:t xml:space="preserve"> </w:t>
-      </w:r>
-      <w:proofErr w:type="spellStart"/>
-      <w:r>
-        <w:rPr>
-          <w:b/>
-        </w:rPr>
-        <w:t>veya</w:t>
-      </w:r>
-      <w:proofErr w:type="spellEnd"/>
-      <w:r>
-        <w:rPr>
-          <w:b/>
-        </w:rPr>
-        <w:t xml:space="preserve"> </w:t>
-      </w:r>
-      <w:proofErr w:type="spellStart"/>
-      <w:r>
-        <w:rPr>
-          <w:b/>
-        </w:rPr>
-        <w:t>Konuşma</w:t>
-      </w:r>
-      <w:proofErr w:type="spellEnd"/>
-      <w:r>
-        <w:rPr>
-          <w:b/>
-        </w:rPr>
-        <w:t xml:space="preserve">) </w:t>
-      </w:r>
-      <w:proofErr w:type="spellStart"/>
-      <w:r>
-        <w:rPr>
-          <w:b/>
-        </w:rPr>
-        <w:t>mutlaka</w:t>
-      </w:r>
-      <w:proofErr w:type="spellEnd"/>
-      <w:r>
-        <w:rPr>
-          <w:b/>
-        </w:rPr>
-        <w:t xml:space="preserve"> </w:t>
-      </w:r>
-      <w:proofErr w:type="spellStart"/>
-      <w:r>
-        <w:rPr>
-          <w:b/>
-        </w:rPr>
-        <w:t>belirtilmelidir</w:t>
-      </w:r>
-      <w:proofErr w:type="spellEnd"/>
-      <w:r>
-        <w:rPr>
-          <w:b/>
-        </w:rPr>
-        <w:t>.</w:t>
-      </w:r>
-    </w:p>
-    <w:p>
-      <w:pPr>
-        <w:spacing w:after="60" w:line="240" w:lineRule="auto"/>
-        <w:jc w:val="center"/>
-        <w:rPr>
-          <w:rFonts w:ascii="Times New Roman" w:hAnsi="Times New Roman" w:cs="Times New Roman"/>
-          <w:b/>
-          <w:sz w:val="16"/>
-          <w:szCs w:val="16"/>
+          <w:sz w:val="24"/>
+          <w:szCs w:val="24"/>
         </w:rPr>
       </w:pPr>
       <w:r>
         <w:rPr>
           <w:rFonts w:ascii="Times New Roman" w:hAnsi="Times New Roman" w:cs="Times New Roman"/>
           <w:b/>
-          <w:sz w:val="16"/>
-          <w:szCs w:val="16"/>
+          <w:sz w:val="24"/>
+          <w:szCs w:val="24"/>
         </w:rPr>
         <w:t>SORU BAZLI PUAN ÇİZELGESİ</w:t>
       </w:r>
@@ -1145,27 +508,27 @@
         <w:tblLook w:val="04A0" w:firstRow="1" w:lastRow="0" w:firstColumn="1" w:lastColumn="0" w:noHBand="0" w:noVBand="1"/>
       </w:tblPr>
       <w:tblGrid>
-        <w:gridCol w:w="1807"/>
-        <w:gridCol w:w="349"/>
-        <w:gridCol w:w="349"/>
-        <w:gridCol w:w="349"/>
-        <w:gridCol w:w="349"/>
-        <w:gridCol w:w="349"/>
-        <w:gridCol w:w="349"/>
-        <w:gridCol w:w="349"/>
-        <w:gridCol w:w="349"/>
-        <w:gridCol w:w="349"/>
-        <w:gridCol w:w="429"/>
+        <w:gridCol w:w="1836"/>
         <w:gridCol w:w="714"/>
+        <w:gridCol w:w="714"/>
+        <w:gridCol w:w="714"/>
+        <w:gridCol w:w="714"/>
+        <w:gridCol w:w="714"/>
+        <w:gridCol w:w="715"/>
+        <w:gridCol w:w="714"/>
+        <w:gridCol w:w="714"/>
+        <w:gridCol w:w="714"/>
+        <w:gridCol w:w="714"/>
+        <w:gridCol w:w="715"/>
       </w:tblGrid>
       <w:tr>
         <w:trPr>
-          <w:trHeight w:val="20"/>
+          <w:trHeight w:hRule="exact" w:val="230"/>
           <w:jc w:val="center"/>
         </w:trPr>
         <w:tc>
           <w:tcPr>
-            <w:tcW w:w="0" w:type="auto"/>
+            <w:tcW w:w="1836" w:type="dxa"/>
             <w:shd w:val="clear" w:color="auto" w:fill="C6D9F1" w:themeFill="text2" w:themeFillTint="33"/>
             <w:tcMar>
               <w:top w:w="70" w:type="dxa"/>
@@ -1181,8 +544,8 @@
               <w:rPr>
                 <w:rFonts w:ascii="Times New Roman" w:hAnsi="Times New Roman" w:cs="Times New Roman"/>
                 <w:b/>
-                <w:sz w:val="16"/>
-                <w:szCs w:val="16"/>
+                <w:sz w:val="14"/>
+                <w:szCs w:val="14"/>
               </w:rPr>
             </w:pPr>
             <w:proofErr w:type="spellStart"/>
@@ -1190,8 +553,8 @@
               <w:rPr>
                 <w:rFonts w:ascii="Times New Roman" w:hAnsi="Times New Roman" w:cs="Times New Roman"/>
                 <w:b/>
-                <w:sz w:val="16"/>
-                <w:szCs w:val="16"/>
+                <w:sz w:val="14"/>
+                <w:szCs w:val="14"/>
               </w:rPr>
               <w:t>Sorular</w:t>
             </w:r>
@@ -1200,7 +563,7 @@
         </w:tc>
         <w:tc>
           <w:tcPr>
-            <w:tcW w:w="0" w:type="auto"/>
+            <w:tcW w:w="714" w:type="dxa"/>
             <w:shd w:val="clear" w:color="auto" w:fill="C6D9F1" w:themeFill="text2" w:themeFillTint="33"/>
             <w:tcMar>
               <w:top w:w="70" w:type="dxa"/>
@@ -1216,16 +579,16 @@
               <w:rPr>
                 <w:rFonts w:ascii="Times New Roman" w:hAnsi="Times New Roman" w:cs="Times New Roman"/>
                 <w:b/>
-                <w:sz w:val="16"/>
-                <w:szCs w:val="16"/>
+                <w:sz w:val="14"/>
+                <w:szCs w:val="14"/>
               </w:rPr>
             </w:pPr>
             <w:r>
               <w:rPr>
                 <w:rFonts w:ascii="Times New Roman" w:hAnsi="Times New Roman" w:cs="Times New Roman"/>
                 <w:b/>
-                <w:sz w:val="16"/>
-                <w:szCs w:val="16"/>
+                <w:sz w:val="14"/>
+                <w:szCs w:val="14"/>
               </w:rPr>
               <w:t>S1</w:t>
             </w:r>
@@ -1233,7 +596,7 @@
         </w:tc>
         <w:tc>
           <w:tcPr>
-            <w:tcW w:w="0" w:type="auto"/>
+            <w:tcW w:w="714" w:type="dxa"/>
             <w:shd w:val="clear" w:color="auto" w:fill="C6D9F1" w:themeFill="text2" w:themeFillTint="33"/>
             <w:tcMar>
               <w:top w:w="70" w:type="dxa"/>
@@ -1249,16 +612,16 @@
               <w:rPr>
                 <w:rFonts w:ascii="Times New Roman" w:hAnsi="Times New Roman" w:cs="Times New Roman"/>
                 <w:b/>
-                <w:sz w:val="16"/>
-                <w:szCs w:val="16"/>
+                <w:sz w:val="14"/>
+                <w:szCs w:val="14"/>
               </w:rPr>
             </w:pPr>
             <w:r>
               <w:rPr>
                 <w:rFonts w:ascii="Times New Roman" w:hAnsi="Times New Roman" w:cs="Times New Roman"/>
                 <w:b/>
-                <w:sz w:val="16"/>
-                <w:szCs w:val="16"/>
+                <w:sz w:val="14"/>
+                <w:szCs w:val="14"/>
               </w:rPr>
               <w:t>S2</w:t>
             </w:r>
@@ -1266,7 +629,7 @@
         </w:tc>
         <w:tc>
           <w:tcPr>
-            <w:tcW w:w="0" w:type="auto"/>
+            <w:tcW w:w="714" w:type="dxa"/>
             <w:shd w:val="clear" w:color="auto" w:fill="C6D9F1" w:themeFill="text2" w:themeFillTint="33"/>
             <w:tcMar>
               <w:top w:w="70" w:type="dxa"/>
@@ -1282,16 +645,16 @@
               <w:rPr>
                 <w:rFonts w:ascii="Times New Roman" w:hAnsi="Times New Roman" w:cs="Times New Roman"/>
                 <w:b/>
-                <w:sz w:val="16"/>
-                <w:szCs w:val="16"/>
+                <w:sz w:val="14"/>
+                <w:szCs w:val="14"/>
               </w:rPr>
             </w:pPr>
             <w:r>
               <w:rPr>
                 <w:rFonts w:ascii="Times New Roman" w:hAnsi="Times New Roman" w:cs="Times New Roman"/>
                 <w:b/>
-                <w:sz w:val="16"/>
-                <w:szCs w:val="16"/>
+                <w:sz w:val="14"/>
+                <w:szCs w:val="14"/>
               </w:rPr>
               <w:t>S3</w:t>
             </w:r>
@@ -1299,7 +662,7 @@
         </w:tc>
         <w:tc>
           <w:tcPr>
-            <w:tcW w:w="0" w:type="auto"/>
+            <w:tcW w:w="714" w:type="dxa"/>
             <w:shd w:val="clear" w:color="auto" w:fill="C6D9F1" w:themeFill="text2" w:themeFillTint="33"/>
             <w:tcMar>
               <w:top w:w="70" w:type="dxa"/>
@@ -1315,16 +678,16 @@
               <w:rPr>
                 <w:rFonts w:ascii="Times New Roman" w:hAnsi="Times New Roman" w:cs="Times New Roman"/>
                 <w:b/>
-                <w:sz w:val="16"/>
-                <w:szCs w:val="16"/>
+                <w:sz w:val="14"/>
+                <w:szCs w:val="14"/>
               </w:rPr>
             </w:pPr>
             <w:r>
               <w:rPr>
                 <w:rFonts w:ascii="Times New Roman" w:hAnsi="Times New Roman" w:cs="Times New Roman"/>
                 <w:b/>
-                <w:sz w:val="16"/>
-                <w:szCs w:val="16"/>
+                <w:sz w:val="14"/>
+                <w:szCs w:val="14"/>
               </w:rPr>
               <w:t>S4</w:t>
             </w:r>
@@ -1332,7 +695,7 @@
         </w:tc>
         <w:tc>
           <w:tcPr>
-            <w:tcW w:w="0" w:type="auto"/>
+            <w:tcW w:w="714" w:type="dxa"/>
             <w:shd w:val="clear" w:color="auto" w:fill="C6D9F1" w:themeFill="text2" w:themeFillTint="33"/>
             <w:tcMar>
               <w:top w:w="70" w:type="dxa"/>
@@ -1348,16 +711,16 @@
               <w:rPr>
                 <w:rFonts w:ascii="Times New Roman" w:hAnsi="Times New Roman" w:cs="Times New Roman"/>
                 <w:b/>
-                <w:sz w:val="16"/>
-                <w:szCs w:val="16"/>
+                <w:sz w:val="14"/>
+                <w:szCs w:val="14"/>
               </w:rPr>
             </w:pPr>
             <w:r>
               <w:rPr>
                 <w:rFonts w:ascii="Times New Roman" w:hAnsi="Times New Roman" w:cs="Times New Roman"/>
                 <w:b/>
-                <w:sz w:val="16"/>
-                <w:szCs w:val="16"/>
+                <w:sz w:val="14"/>
+                <w:szCs w:val="14"/>
               </w:rPr>
               <w:t>S5</w:t>
             </w:r>
@@ -1365,7 +728,7 @@
         </w:tc>
         <w:tc>
           <w:tcPr>
-            <w:tcW w:w="0" w:type="auto"/>
+            <w:tcW w:w="715" w:type="dxa"/>
             <w:shd w:val="clear" w:color="auto" w:fill="C6D9F1" w:themeFill="text2" w:themeFillTint="33"/>
             <w:tcMar>
               <w:top w:w="70" w:type="dxa"/>
@@ -1381,16 +744,16 @@
               <w:rPr>
                 <w:rFonts w:ascii="Times New Roman" w:hAnsi="Times New Roman" w:cs="Times New Roman"/>
                 <w:b/>
-                <w:sz w:val="16"/>
-                <w:szCs w:val="16"/>
+                <w:sz w:val="14"/>
+                <w:szCs w:val="14"/>
               </w:rPr>
             </w:pPr>
             <w:r>
               <w:rPr>
                 <w:rFonts w:ascii="Times New Roman" w:hAnsi="Times New Roman" w:cs="Times New Roman"/>
                 <w:b/>
-                <w:sz w:val="16"/>
-                <w:szCs w:val="16"/>
+                <w:sz w:val="14"/>
+                <w:szCs w:val="14"/>
               </w:rPr>
               <w:t>S6</w:t>
             </w:r>
@@ -1398,7 +761,7 @@
         </w:tc>
         <w:tc>
           <w:tcPr>
-            <w:tcW w:w="0" w:type="auto"/>
+            <w:tcW w:w="714" w:type="dxa"/>
             <w:shd w:val="clear" w:color="auto" w:fill="C6D9F1" w:themeFill="text2" w:themeFillTint="33"/>
             <w:tcMar>
               <w:top w:w="70" w:type="dxa"/>
@@ -1414,16 +777,16 @@
               <w:rPr>
                 <w:rFonts w:ascii="Times New Roman" w:hAnsi="Times New Roman" w:cs="Times New Roman"/>
                 <w:b/>
-                <w:sz w:val="16"/>
-                <w:szCs w:val="16"/>
+                <w:sz w:val="14"/>
+                <w:szCs w:val="14"/>
               </w:rPr>
             </w:pPr>
             <w:r>
               <w:rPr>
                 <w:rFonts w:ascii="Times New Roman" w:hAnsi="Times New Roman" w:cs="Times New Roman"/>
                 <w:b/>
-                <w:sz w:val="16"/>
-                <w:szCs w:val="16"/>
+                <w:sz w:val="14"/>
+                <w:szCs w:val="14"/>
               </w:rPr>
               <w:t>S7</w:t>
             </w:r>
@@ -1431,7 +794,7 @@
         </w:tc>
         <w:tc>
           <w:tcPr>
-            <w:tcW w:w="0" w:type="auto"/>
+            <w:tcW w:w="714" w:type="dxa"/>
             <w:shd w:val="clear" w:color="auto" w:fill="C6D9F1" w:themeFill="text2" w:themeFillTint="33"/>
             <w:tcMar>
               <w:top w:w="70" w:type="dxa"/>
@@ -1447,16 +810,16 @@
               <w:rPr>
                 <w:rFonts w:ascii="Times New Roman" w:hAnsi="Times New Roman" w:cs="Times New Roman"/>
                 <w:b/>
-                <w:sz w:val="16"/>
-                <w:szCs w:val="16"/>
+                <w:sz w:val="14"/>
+                <w:szCs w:val="14"/>
               </w:rPr>
             </w:pPr>
             <w:r>
               <w:rPr>
                 <w:rFonts w:ascii="Times New Roman" w:hAnsi="Times New Roman" w:cs="Times New Roman"/>
                 <w:b/>
-                <w:sz w:val="16"/>
-                <w:szCs w:val="16"/>
+                <w:sz w:val="14"/>
+                <w:szCs w:val="14"/>
               </w:rPr>
               <w:t>S8</w:t>
             </w:r>
@@ -1464,7 +827,7 @@
         </w:tc>
         <w:tc>
           <w:tcPr>
-            <w:tcW w:w="0" w:type="auto"/>
+            <w:tcW w:w="714" w:type="dxa"/>
             <w:shd w:val="clear" w:color="auto" w:fill="C6D9F1" w:themeFill="text2" w:themeFillTint="33"/>
             <w:tcMar>
               <w:top w:w="70" w:type="dxa"/>
@@ -1480,16 +843,16 @@
               <w:rPr>
                 <w:rFonts w:ascii="Times New Roman" w:hAnsi="Times New Roman" w:cs="Times New Roman"/>
                 <w:b/>
-                <w:sz w:val="16"/>
-                <w:szCs w:val="16"/>
+                <w:sz w:val="14"/>
+                <w:szCs w:val="14"/>
               </w:rPr>
             </w:pPr>
             <w:r>
               <w:rPr>
                 <w:rFonts w:ascii="Times New Roman" w:hAnsi="Times New Roman" w:cs="Times New Roman"/>
                 <w:b/>
-                <w:sz w:val="16"/>
-                <w:szCs w:val="16"/>
+                <w:sz w:val="14"/>
+                <w:szCs w:val="14"/>
               </w:rPr>
               <w:t>S9</w:t>
             </w:r>
@@ -1497,7 +860,7 @@
         </w:tc>
         <w:tc>
           <w:tcPr>
-            <w:tcW w:w="0" w:type="auto"/>
+            <w:tcW w:w="714" w:type="dxa"/>
             <w:shd w:val="clear" w:color="auto" w:fill="C6D9F1" w:themeFill="text2" w:themeFillTint="33"/>
             <w:tcMar>
               <w:top w:w="70" w:type="dxa"/>
@@ -1513,16 +876,16 @@
               <w:rPr>
                 <w:rFonts w:ascii="Times New Roman" w:hAnsi="Times New Roman" w:cs="Times New Roman"/>
                 <w:b/>
-                <w:sz w:val="16"/>
-                <w:szCs w:val="16"/>
+                <w:sz w:val="14"/>
+                <w:szCs w:val="14"/>
               </w:rPr>
             </w:pPr>
             <w:r>
               <w:rPr>
                 <w:rFonts w:ascii="Times New Roman" w:hAnsi="Times New Roman" w:cs="Times New Roman"/>
                 <w:b/>
-                <w:sz w:val="16"/>
-                <w:szCs w:val="16"/>
+                <w:sz w:val="14"/>
+                <w:szCs w:val="14"/>
               </w:rPr>
               <w:t>S10</w:t>
             </w:r>
@@ -1530,7 +893,7 @@
         </w:tc>
         <w:tc>
           <w:tcPr>
-            <w:tcW w:w="0" w:type="auto"/>
+            <w:tcW w:w="715" w:type="dxa"/>
             <w:shd w:val="clear" w:color="auto" w:fill="C6D9F1" w:themeFill="text2" w:themeFillTint="33"/>
             <w:tcMar>
               <w:top w:w="70" w:type="dxa"/>
@@ -1546,16 +909,16 @@
               <w:rPr>
                 <w:rFonts w:ascii="Times New Roman" w:hAnsi="Times New Roman" w:cs="Times New Roman"/>
                 <w:b/>
-                <w:sz w:val="16"/>
-                <w:szCs w:val="16"/>
+                <w:sz w:val="14"/>
+                <w:szCs w:val="14"/>
               </w:rPr>
             </w:pPr>
             <w:r>
               <w:rPr>
                 <w:rFonts w:ascii="Times New Roman" w:hAnsi="Times New Roman" w:cs="Times New Roman"/>
                 <w:b/>
-                <w:sz w:val="16"/>
-                <w:szCs w:val="16"/>
+                <w:sz w:val="14"/>
+                <w:szCs w:val="14"/>
               </w:rPr>
               <w:t>Toplam</w:t>
             </w:r>
@@ -1564,12 +927,12 @@
       </w:tr>
       <w:tr>
         <w:trPr>
-          <w:trHeight w:val="133"/>
+          <w:trHeight w:hRule="exact" w:val="230"/>
           <w:jc w:val="center"/>
         </w:trPr>
         <w:tc>
           <w:tcPr>
-            <w:tcW w:w="0" w:type="auto"/>
+            <w:tcW w:w="1836" w:type="dxa"/>
             <w:tcMar>
               <w:top w:w="70" w:type="dxa"/>
               <w:left w:w="90" w:type="dxa"/>
@@ -1584,16 +947,16 @@
               <w:rPr>
                 <w:rFonts w:ascii="Times New Roman" w:hAnsi="Times New Roman" w:cs="Times New Roman"/>
                 <w:b/>
-                <w:sz w:val="16"/>
-                <w:szCs w:val="16"/>
+                <w:sz w:val="14"/>
+                <w:szCs w:val="14"/>
               </w:rPr>
             </w:pPr>
             <w:r>
               <w:rPr>
                 <w:rFonts w:ascii="Times New Roman" w:hAnsi="Times New Roman" w:cs="Times New Roman"/>
                 <w:b/>
-                <w:sz w:val="16"/>
-                <w:szCs w:val="16"/>
+                <w:sz w:val="14"/>
+                <w:szCs w:val="14"/>
               </w:rPr>
               <w:t>Azami Puan</w:t>
             </w:r>
@@ -1601,7 +964,7 @@
         </w:tc>
         <w:tc>
           <w:tcPr>
-            <w:tcW w:w="0" w:type="auto"/>
+            <w:tcW w:w="714" w:type="dxa"/>
             <w:tcMar>
               <w:top w:w="70" w:type="dxa"/>
               <w:left w:w="90" w:type="dxa"/>
@@ -1616,16 +979,16 @@
               <w:rPr>
                 <w:rFonts w:ascii="Times New Roman" w:hAnsi="Times New Roman" w:cs="Times New Roman"/>
                 <w:b/>
-                <w:sz w:val="16"/>
-                <w:szCs w:val="16"/>
+                <w:sz w:val="14"/>
+                <w:szCs w:val="14"/>
               </w:rPr>
             </w:pPr>
             <w:r>
               <w:rPr>
                 <w:rFonts w:ascii="Times New Roman" w:hAnsi="Times New Roman" w:cs="Times New Roman"/>
                 <w:b/>
-                <w:sz w:val="16"/>
-                <w:szCs w:val="16"/>
+                <w:sz w:val="14"/>
+                <w:szCs w:val="14"/>
               </w:rPr>
               <w:t>10</w:t>
             </w:r>
@@ -1633,7 +996,7 @@
         </w:tc>
         <w:tc>
           <w:tcPr>
-            <w:tcW w:w="0" w:type="auto"/>
+            <w:tcW w:w="714" w:type="dxa"/>
             <w:tcMar>
               <w:top w:w="70" w:type="dxa"/>
               <w:left w:w="90" w:type="dxa"/>
@@ -1648,16 +1011,16 @@
               <w:rPr>
                 <w:rFonts w:ascii="Times New Roman" w:hAnsi="Times New Roman" w:cs="Times New Roman"/>
                 <w:b/>
-                <w:sz w:val="16"/>
-                <w:szCs w:val="16"/>
+                <w:sz w:val="14"/>
+                <w:szCs w:val="14"/>
               </w:rPr>
             </w:pPr>
             <w:r>
               <w:rPr>
                 <w:rFonts w:ascii="Times New Roman" w:hAnsi="Times New Roman" w:cs="Times New Roman"/>
                 <w:b/>
-                <w:sz w:val="16"/>
-                <w:szCs w:val="16"/>
+                <w:sz w:val="14"/>
+                <w:szCs w:val="14"/>
               </w:rPr>
               <w:t>10</w:t>
             </w:r>
@@ -1665,7 +1028,7 @@
         </w:tc>
         <w:tc>
           <w:tcPr>
-            <w:tcW w:w="0" w:type="auto"/>
+            <w:tcW w:w="714" w:type="dxa"/>
             <w:tcMar>
               <w:top w:w="70" w:type="dxa"/>
               <w:left w:w="90" w:type="dxa"/>
@@ -1680,16 +1043,16 @@
               <w:rPr>
                 <w:rFonts w:ascii="Times New Roman" w:hAnsi="Times New Roman" w:cs="Times New Roman"/>
                 <w:b/>
-                <w:sz w:val="16"/>
-                <w:szCs w:val="16"/>
+                <w:sz w:val="14"/>
+                <w:szCs w:val="14"/>
               </w:rPr>
             </w:pPr>
             <w:r>
               <w:rPr>
                 <w:rFonts w:ascii="Times New Roman" w:hAnsi="Times New Roman" w:cs="Times New Roman"/>
                 <w:b/>
-                <w:sz w:val="16"/>
-                <w:szCs w:val="16"/>
+                <w:sz w:val="14"/>
+                <w:szCs w:val="14"/>
               </w:rPr>
               <w:t>10</w:t>
             </w:r>
@@ -1697,7 +1060,7 @@
         </w:tc>
         <w:tc>
           <w:tcPr>
-            <w:tcW w:w="0" w:type="auto"/>
+            <w:tcW w:w="714" w:type="dxa"/>
             <w:tcMar>
               <w:top w:w="70" w:type="dxa"/>
               <w:left w:w="90" w:type="dxa"/>
@@ -1712,16 +1075,16 @@
               <w:rPr>
                 <w:rFonts w:ascii="Times New Roman" w:hAnsi="Times New Roman" w:cs="Times New Roman"/>
                 <w:b/>
-                <w:sz w:val="16"/>
-                <w:szCs w:val="16"/>
+                <w:sz w:val="14"/>
+                <w:szCs w:val="14"/>
               </w:rPr>
             </w:pPr>
             <w:r>
               <w:rPr>
                 <w:rFonts w:ascii="Times New Roman" w:hAnsi="Times New Roman" w:cs="Times New Roman"/>
                 <w:b/>
-                <w:sz w:val="16"/>
-                <w:szCs w:val="16"/>
+                <w:sz w:val="14"/>
+                <w:szCs w:val="14"/>
               </w:rPr>
               <w:t>10</w:t>
             </w:r>
@@ -1729,7 +1092,7 @@
         </w:tc>
         <w:tc>
           <w:tcPr>
-            <w:tcW w:w="0" w:type="auto"/>
+            <w:tcW w:w="714" w:type="dxa"/>
             <w:tcMar>
               <w:top w:w="70" w:type="dxa"/>
               <w:left w:w="90" w:type="dxa"/>
@@ -1744,16 +1107,16 @@
               <w:rPr>
                 <w:rFonts w:ascii="Times New Roman" w:hAnsi="Times New Roman" w:cs="Times New Roman"/>
                 <w:b/>
-                <w:sz w:val="16"/>
-                <w:szCs w:val="16"/>
+                <w:sz w:val="14"/>
+                <w:szCs w:val="14"/>
               </w:rPr>
             </w:pPr>
             <w:r>
               <w:rPr>
                 <w:rFonts w:ascii="Times New Roman" w:hAnsi="Times New Roman" w:cs="Times New Roman"/>
                 <w:b/>
-                <w:sz w:val="16"/>
-                <w:szCs w:val="16"/>
+                <w:sz w:val="14"/>
+                <w:szCs w:val="14"/>
               </w:rPr>
               <w:t>10</w:t>
             </w:r>
@@ -1761,7 +1124,7 @@
         </w:tc>
         <w:tc>
           <w:tcPr>
-            <w:tcW w:w="0" w:type="auto"/>
+            <w:tcW w:w="715" w:type="dxa"/>
             <w:tcMar>
               <w:top w:w="70" w:type="dxa"/>
               <w:left w:w="90" w:type="dxa"/>
@@ -1776,16 +1139,16 @@
               <w:rPr>
                 <w:rFonts w:ascii="Times New Roman" w:hAnsi="Times New Roman" w:cs="Times New Roman"/>
                 <w:b/>
-                <w:sz w:val="16"/>
-                <w:szCs w:val="16"/>
+                <w:sz w:val="14"/>
+                <w:szCs w:val="14"/>
               </w:rPr>
             </w:pPr>
             <w:r>
               <w:rPr>
                 <w:rFonts w:ascii="Times New Roman" w:hAnsi="Times New Roman" w:cs="Times New Roman"/>
                 <w:b/>
-                <w:sz w:val="16"/>
-                <w:szCs w:val="16"/>
+                <w:sz w:val="14"/>
+                <w:szCs w:val="14"/>
               </w:rPr>
               <w:t>10</w:t>
             </w:r>
@@ -1793,7 +1156,7 @@
         </w:tc>
         <w:tc>
           <w:tcPr>
-            <w:tcW w:w="0" w:type="auto"/>
+            <w:tcW w:w="714" w:type="dxa"/>
             <w:tcMar>
               <w:top w:w="70" w:type="dxa"/>
               <w:left w:w="90" w:type="dxa"/>
@@ -1808,16 +1171,16 @@
               <w:rPr>
                 <w:rFonts w:ascii="Times New Roman" w:hAnsi="Times New Roman" w:cs="Times New Roman"/>
                 <w:b/>
-                <w:sz w:val="16"/>
-                <w:szCs w:val="16"/>
+                <w:sz w:val="14"/>
+                <w:szCs w:val="14"/>
               </w:rPr>
             </w:pPr>
             <w:r>
               <w:rPr>
                 <w:rFonts w:ascii="Times New Roman" w:hAnsi="Times New Roman" w:cs="Times New Roman"/>
                 <w:b/>
-                <w:sz w:val="16"/>
-                <w:szCs w:val="16"/>
+                <w:sz w:val="14"/>
+                <w:szCs w:val="14"/>
               </w:rPr>
               <w:t>10</w:t>
             </w:r>
@@ -1825,7 +1188,7 @@
         </w:tc>
         <w:tc>
           <w:tcPr>
-            <w:tcW w:w="0" w:type="auto"/>
+            <w:tcW w:w="714" w:type="dxa"/>
             <w:tcMar>
               <w:top w:w="70" w:type="dxa"/>
               <w:left w:w="90" w:type="dxa"/>
@@ -1840,16 +1203,16 @@
               <w:rPr>
                 <w:rFonts w:ascii="Times New Roman" w:hAnsi="Times New Roman" w:cs="Times New Roman"/>
                 <w:b/>
-                <w:sz w:val="16"/>
-                <w:szCs w:val="16"/>
+                <w:sz w:val="14"/>
+                <w:szCs w:val="14"/>
               </w:rPr>
             </w:pPr>
             <w:r>
               <w:rPr>
                 <w:rFonts w:ascii="Times New Roman" w:hAnsi="Times New Roman" w:cs="Times New Roman"/>
                 <w:b/>
-                <w:sz w:val="16"/>
-                <w:szCs w:val="16"/>
+                <w:sz w:val="14"/>
+                <w:szCs w:val="14"/>
               </w:rPr>
               <w:t>10</w:t>
             </w:r>
@@ -1857,7 +1220,7 @@
         </w:tc>
         <w:tc>
           <w:tcPr>
-            <w:tcW w:w="0" w:type="auto"/>
+            <w:tcW w:w="714" w:type="dxa"/>
             <w:tcMar>
               <w:top w:w="70" w:type="dxa"/>
               <w:left w:w="90" w:type="dxa"/>
@@ -1872,16 +1235,16 @@
               <w:rPr>
                 <w:rFonts w:ascii="Times New Roman" w:hAnsi="Times New Roman" w:cs="Times New Roman"/>
                 <w:b/>
-                <w:sz w:val="16"/>
-                <w:szCs w:val="16"/>
+                <w:sz w:val="14"/>
+                <w:szCs w:val="14"/>
               </w:rPr>
             </w:pPr>
             <w:r>
               <w:rPr>
                 <w:rFonts w:ascii="Times New Roman" w:hAnsi="Times New Roman" w:cs="Times New Roman"/>
                 <w:b/>
-                <w:sz w:val="16"/>
-                <w:szCs w:val="16"/>
+                <w:sz w:val="14"/>
+                <w:szCs w:val="14"/>
               </w:rPr>
               <w:t>10</w:t>
             </w:r>
@@ -1889,7 +1252,7 @@
         </w:tc>
         <w:tc>
           <w:tcPr>
-            <w:tcW w:w="0" w:type="auto"/>
+            <w:tcW w:w="714" w:type="dxa"/>
             <w:tcMar>
               <w:top w:w="70" w:type="dxa"/>
               <w:left w:w="90" w:type="dxa"/>
@@ -1904,16 +1267,16 @@
               <w:rPr>
                 <w:rFonts w:ascii="Times New Roman" w:hAnsi="Times New Roman" w:cs="Times New Roman"/>
                 <w:b/>
-                <w:sz w:val="16"/>
-                <w:szCs w:val="16"/>
+                <w:sz w:val="14"/>
+                <w:szCs w:val="14"/>
               </w:rPr>
             </w:pPr>
             <w:r>
               <w:rPr>
                 <w:rFonts w:ascii="Times New Roman" w:hAnsi="Times New Roman" w:cs="Times New Roman"/>
                 <w:b/>
-                <w:sz w:val="16"/>
-                <w:szCs w:val="16"/>
+                <w:sz w:val="14"/>
+                <w:szCs w:val="14"/>
               </w:rPr>
               <w:t>10</w:t>
             </w:r>
@@ -1921,7 +1284,7 @@
         </w:tc>
         <w:tc>
           <w:tcPr>
-            <w:tcW w:w="0" w:type="auto"/>
+            <w:tcW w:w="715" w:type="dxa"/>
             <w:tcMar>
               <w:top w:w="70" w:type="dxa"/>
               <w:left w:w="90" w:type="dxa"/>
@@ -1936,16 +1299,16 @@
               <w:rPr>
                 <w:rFonts w:ascii="Times New Roman" w:hAnsi="Times New Roman" w:cs="Times New Roman"/>
                 <w:b/>
-                <w:sz w:val="16"/>
-                <w:szCs w:val="16"/>
+                <w:sz w:val="14"/>
+                <w:szCs w:val="14"/>
               </w:rPr>
             </w:pPr>
             <w:r>
               <w:rPr>
                 <w:rFonts w:ascii="Times New Roman" w:hAnsi="Times New Roman" w:cs="Times New Roman"/>
                 <w:b/>
-                <w:sz w:val="16"/>
-                <w:szCs w:val="16"/>
+                <w:sz w:val="14"/>
+                <w:szCs w:val="14"/>
               </w:rPr>
               <w:t>100</w:t>
             </w:r>
@@ -1954,11 +1317,12 @@
       </w:tr>
       <w:tr>
         <w:trPr>
+          <w:trHeight w:hRule="exact" w:val="230"/>
           <w:jc w:val="center"/>
         </w:trPr>
         <w:tc>
           <w:tcPr>
-            <w:tcW w:w="0" w:type="auto"/>
+            <w:tcW w:w="1836" w:type="dxa"/>
             <w:tcMar>
               <w:top w:w="70" w:type="dxa"/>
               <w:left w:w="90" w:type="dxa"/>
@@ -1973,8 +1337,8 @@
               <w:rPr>
                 <w:rFonts w:ascii="Times New Roman" w:hAnsi="Times New Roman" w:cs="Times New Roman"/>
                 <w:b/>
-                <w:sz w:val="16"/>
-                <w:szCs w:val="16"/>
+                <w:sz w:val="14"/>
+                <w:szCs w:val="14"/>
               </w:rPr>
             </w:pPr>
             <w:proofErr w:type="spellStart"/>
@@ -1982,8 +1346,8 @@
               <w:rPr>
                 <w:rFonts w:ascii="Times New Roman" w:hAnsi="Times New Roman" w:cs="Times New Roman"/>
                 <w:b/>
-                <w:sz w:val="16"/>
-                <w:szCs w:val="16"/>
+                <w:sz w:val="14"/>
+                <w:szCs w:val="14"/>
               </w:rPr>
               <w:t>Öğrencinin</w:t>
             </w:r>
@@ -1992,8 +1356,8 @@
               <w:rPr>
                 <w:rFonts w:ascii="Times New Roman" w:hAnsi="Times New Roman" w:cs="Times New Roman"/>
                 <w:b/>
-                <w:sz w:val="16"/>
-                <w:szCs w:val="16"/>
+                <w:sz w:val="14"/>
+                <w:szCs w:val="14"/>
               </w:rPr>
               <w:t xml:space="preserve"> </w:t>
             </w:r>
@@ -2002,8 +1366,8 @@
               <w:rPr>
                 <w:rFonts w:ascii="Times New Roman" w:hAnsi="Times New Roman" w:cs="Times New Roman"/>
                 <w:b/>
-                <w:sz w:val="16"/>
-                <w:szCs w:val="16"/>
+                <w:sz w:val="14"/>
+                <w:szCs w:val="14"/>
               </w:rPr>
               <w:t>Aldığı</w:t>
             </w:r>
@@ -2012,8 +1376,8 @@
               <w:rPr>
                 <w:rFonts w:ascii="Times New Roman" w:hAnsi="Times New Roman" w:cs="Times New Roman"/>
                 <w:b/>
-                <w:sz w:val="16"/>
-                <w:szCs w:val="16"/>
+                <w:sz w:val="14"/>
+                <w:szCs w:val="14"/>
               </w:rPr>
               <w:t xml:space="preserve"> Puan</w:t>
             </w:r>
@@ -2021,7 +1385,7 @@
         </w:tc>
         <w:tc>
           <w:tcPr>
-            <w:tcW w:w="0" w:type="auto"/>
+            <w:tcW w:w="714" w:type="dxa"/>
             <w:tcMar>
               <w:top w:w="70" w:type="dxa"/>
               <w:left w:w="90" w:type="dxa"/>
@@ -2036,15 +1400,15 @@
               <w:rPr>
                 <w:rFonts w:ascii="Times New Roman" w:hAnsi="Times New Roman" w:cs="Times New Roman"/>
                 <w:b/>
-                <w:sz w:val="16"/>
-                <w:szCs w:val="16"/>
+                <w:sz w:val="14"/>
+                <w:szCs w:val="14"/>
               </w:rPr>
             </w:pPr>
           </w:p>
         </w:tc>
         <w:tc>
           <w:tcPr>
-            <w:tcW w:w="0" w:type="auto"/>
+            <w:tcW w:w="714" w:type="dxa"/>
             <w:tcMar>
               <w:top w:w="70" w:type="dxa"/>
               <w:left w:w="90" w:type="dxa"/>
@@ -2058,16 +1422,16 @@
               <w:jc w:val="center"/>
               <w:rPr>
                 <w:rFonts w:ascii="Times New Roman" w:hAnsi="Times New Roman" w:cs="Times New Roman"/>
-                <w:bCs/>
-                <w:sz w:val="16"/>
-                <w:szCs w:val="16"/>
+                <w:b/>
+                <w:sz w:val="14"/>
+                <w:szCs w:val="14"/>
               </w:rPr>
             </w:pPr>
           </w:p>
         </w:tc>
         <w:tc>
           <w:tcPr>
-            <w:tcW w:w="0" w:type="auto"/>
+            <w:tcW w:w="714" w:type="dxa"/>
             <w:tcMar>
               <w:top w:w="70" w:type="dxa"/>
               <w:left w:w="90" w:type="dxa"/>
@@ -2081,16 +1445,16 @@
               <w:jc w:val="center"/>
               <w:rPr>
                 <w:rFonts w:ascii="Times New Roman" w:hAnsi="Times New Roman" w:cs="Times New Roman"/>
-                <w:bCs/>
-                <w:sz w:val="16"/>
-                <w:szCs w:val="16"/>
+                <w:b/>
+                <w:sz w:val="14"/>
+                <w:szCs w:val="14"/>
               </w:rPr>
             </w:pPr>
           </w:p>
         </w:tc>
         <w:tc>
           <w:tcPr>
-            <w:tcW w:w="0" w:type="auto"/>
+            <w:tcW w:w="714" w:type="dxa"/>
             <w:tcMar>
               <w:top w:w="70" w:type="dxa"/>
               <w:left w:w="90" w:type="dxa"/>
@@ -2104,16 +1468,16 @@
               <w:jc w:val="center"/>
               <w:rPr>
                 <w:rFonts w:ascii="Times New Roman" w:hAnsi="Times New Roman" w:cs="Times New Roman"/>
-                <w:bCs/>
-                <w:sz w:val="16"/>
-                <w:szCs w:val="16"/>
+                <w:b/>
+                <w:sz w:val="14"/>
+                <w:szCs w:val="14"/>
               </w:rPr>
             </w:pPr>
           </w:p>
         </w:tc>
         <w:tc>
           <w:tcPr>
-            <w:tcW w:w="0" w:type="auto"/>
+            <w:tcW w:w="714" w:type="dxa"/>
             <w:tcMar>
               <w:top w:w="70" w:type="dxa"/>
               <w:left w:w="90" w:type="dxa"/>
@@ -2127,16 +1491,16 @@
               <w:jc w:val="center"/>
               <w:rPr>
                 <w:rFonts w:ascii="Times New Roman" w:hAnsi="Times New Roman" w:cs="Times New Roman"/>
-                <w:bCs/>
-                <w:sz w:val="16"/>
-                <w:szCs w:val="16"/>
+                <w:b/>
+                <w:sz w:val="14"/>
+                <w:szCs w:val="14"/>
               </w:rPr>
             </w:pPr>
           </w:p>
         </w:tc>
         <w:tc>
           <w:tcPr>
-            <w:tcW w:w="0" w:type="auto"/>
+            <w:tcW w:w="715" w:type="dxa"/>
             <w:tcMar>
               <w:top w:w="70" w:type="dxa"/>
               <w:left w:w="90" w:type="dxa"/>
@@ -2150,16 +1514,16 @@
               <w:jc w:val="center"/>
               <w:rPr>
                 <w:rFonts w:ascii="Times New Roman" w:hAnsi="Times New Roman" w:cs="Times New Roman"/>
-                <w:bCs/>
-                <w:sz w:val="16"/>
-                <w:szCs w:val="16"/>
+                <w:b/>
+                <w:sz w:val="14"/>
+                <w:szCs w:val="14"/>
               </w:rPr>
             </w:pPr>
           </w:p>
         </w:tc>
         <w:tc>
           <w:tcPr>
-            <w:tcW w:w="0" w:type="auto"/>
+            <w:tcW w:w="714" w:type="dxa"/>
             <w:tcMar>
               <w:top w:w="70" w:type="dxa"/>
               <w:left w:w="90" w:type="dxa"/>
@@ -2173,16 +1537,16 @@
               <w:jc w:val="center"/>
               <w:rPr>
                 <w:rFonts w:ascii="Times New Roman" w:hAnsi="Times New Roman" w:cs="Times New Roman"/>
-                <w:bCs/>
-                <w:sz w:val="16"/>
-                <w:szCs w:val="16"/>
+                <w:b/>
+                <w:sz w:val="14"/>
+                <w:szCs w:val="14"/>
               </w:rPr>
             </w:pPr>
           </w:p>
         </w:tc>
         <w:tc>
           <w:tcPr>
-            <w:tcW w:w="0" w:type="auto"/>
+            <w:tcW w:w="714" w:type="dxa"/>
             <w:tcMar>
               <w:top w:w="70" w:type="dxa"/>
               <w:left w:w="90" w:type="dxa"/>
@@ -2196,16 +1560,16 @@
               <w:jc w:val="center"/>
               <w:rPr>
                 <w:rFonts w:ascii="Times New Roman" w:hAnsi="Times New Roman" w:cs="Times New Roman"/>
-                <w:bCs/>
-                <w:sz w:val="16"/>
-                <w:szCs w:val="16"/>
+                <w:b/>
+                <w:sz w:val="14"/>
+                <w:szCs w:val="14"/>
               </w:rPr>
             </w:pPr>
           </w:p>
         </w:tc>
         <w:tc>
           <w:tcPr>
-            <w:tcW w:w="0" w:type="auto"/>
+            <w:tcW w:w="714" w:type="dxa"/>
             <w:tcMar>
               <w:top w:w="70" w:type="dxa"/>
               <w:left w:w="90" w:type="dxa"/>
@@ -2219,16 +1583,16 @@
               <w:jc w:val="center"/>
               <w:rPr>
                 <w:rFonts w:ascii="Times New Roman" w:hAnsi="Times New Roman" w:cs="Times New Roman"/>
-                <w:bCs/>
-                <w:sz w:val="16"/>
-                <w:szCs w:val="16"/>
+                <w:b/>
+                <w:sz w:val="14"/>
+                <w:szCs w:val="14"/>
               </w:rPr>
             </w:pPr>
           </w:p>
         </w:tc>
         <w:tc>
           <w:tcPr>
-            <w:tcW w:w="0" w:type="auto"/>
+            <w:tcW w:w="714" w:type="dxa"/>
             <w:tcMar>
               <w:top w:w="70" w:type="dxa"/>
               <w:left w:w="90" w:type="dxa"/>
@@ -2242,16 +1606,16 @@
               <w:jc w:val="center"/>
               <w:rPr>
                 <w:rFonts w:ascii="Times New Roman" w:hAnsi="Times New Roman" w:cs="Times New Roman"/>
-                <w:bCs/>
-                <w:sz w:val="16"/>
-                <w:szCs w:val="16"/>
+                <w:b/>
+                <w:sz w:val="14"/>
+                <w:szCs w:val="14"/>
               </w:rPr>
             </w:pPr>
           </w:p>
         </w:tc>
         <w:tc>
           <w:tcPr>
-            <w:tcW w:w="0" w:type="auto"/>
+            <w:tcW w:w="715" w:type="dxa"/>
             <w:tcMar>
               <w:top w:w="70" w:type="dxa"/>
               <w:left w:w="90" w:type="dxa"/>
@@ -2265,9 +1629,9 @@
               <w:jc w:val="center"/>
               <w:rPr>
                 <w:rFonts w:ascii="Times New Roman" w:hAnsi="Times New Roman" w:cs="Times New Roman"/>
-                <w:bCs/>
-                <w:sz w:val="16"/>
-                <w:szCs w:val="16"/>
+                <w:b/>
+                <w:sz w:val="14"/>
+                <w:szCs w:val="14"/>
               </w:rPr>
             </w:pPr>
           </w:p>
@@ -2276,7 +1640,19 @@
     </w:tbl>
     <w:p>
       <w:pPr>
-        <w:spacing w:before="120" w:after="0"/>
+        <w:spacing w:after="0" w:line="240" w:lineRule="auto"/>
+        <w:jc w:val="center"/>
+        <w:rPr>
+          <w:rFonts w:ascii="Times New Roman" w:hAnsi="Times New Roman" w:cs="Times New Roman"/>
+          <w:b/>
+          <w:sz w:val="24"/>
+          <w:szCs w:val="24"/>
+        </w:rPr>
+      </w:pPr>
+    </w:p>
+    <w:p>
+      <w:pPr>
+        <w:spacing w:after="0" w:line="240" w:lineRule="auto"/>
         <w:jc w:val="center"/>
         <w:rPr>
           <w:rFonts w:ascii="Times New Roman" w:hAnsi="Times New Roman" w:cs="Times New Roman"/>
@@ -2297,7 +1673,7 @@
     </w:p>
     <w:p>
       <w:pPr>
-        <w:spacing w:before="120" w:after="0"/>
+        <w:spacing w:after="0" w:line="240" w:lineRule="auto"/>
         <w:rPr>
           <w:rFonts w:ascii="Times New Roman" w:hAnsi="Times New Roman" w:cs="Times New Roman"/>
           <w:b/>
@@ -2312,16 +1688,7 @@
           <w:sz w:val="24"/>
           <w:szCs w:val="24"/>
         </w:rPr>
-        <w:t>S1</w:t>
-      </w:r>
-      <w:r>
-        <w:rPr>
-          <w:rFonts w:ascii="Times New Roman" w:hAnsi="Times New Roman" w:cs="Times New Roman"/>
-          <w:b/>
-          <w:sz w:val="24"/>
-          <w:szCs w:val="24"/>
-        </w:rPr>
-        <w:t>….</w:t>
+        <w:t>S1….</w:t>
       </w:r>
     </w:p>
     <w:sectPr>

</xml_diff>